<commit_message>
pre adding sex/premature narrative and VSL discussion
</commit_message>
<xml_diff>
--- a/docs/who_cvd_targets_paper1.docx
+++ b/docs/who_cvd_targets_paper1.docx
@@ -40,7 +40,7 @@
         <w:pStyle w:val="Date"/>
       </w:pPr>
       <w:r>
-        <w:t xml:space="preserve">April 30, 2026</w:t>
+        <w:t xml:space="preserve">May 01, 2026</w:t>
       </w:r>
     </w:p>
     <w:sdt>
@@ -134,7 +134,7 @@
         <w:pStyle w:val="BodyText"/>
       </w:pPr>
       <w:r>
-        <w:t xml:space="preserve">We did a comparative risk assessment modelling study using a multi-state transition model for 190 countries, 2025–2050. The model projected deaths from ischaemic heart disease, ischaemic stroke, intracerebral haemorrhage, and hypertensive heart disease by age, sex, and country, using WHO Global Health Estimates, GBD 2023, UN World Population Prospects 2024, NCD Risk Factor Collaboration data, and effect estimates. We compared business-as-usual with three intervention scenarios: hypertension control in the general population to reach the WHO target of 150 million people controlled by 2030; 80% blood pressure control among people with diabetes by 2030; 50% statin coverage among eligible adults aged 40 years or older by 2030; and a combined scenario. The primary outcome was cumulative CVD deaths averted during 2025–2050.</w:t>
+        <w:t xml:space="preserve">We did a comparative risk assessment modelling study using a multi-state transition model for 190 countries, 2026 - 2050. The model projected deaths from ischaemic heart disease, ischaemic stroke, intracerebral haemorrhage, and hypertensive heart disease by age, sex, and country, using WHO Global Health Estimates, GBD 2023, UN World Population Prospects 2024, NCD Risk Factor Collaboration data, and effect estimates. We compared business-as-usual with three intervention scenarios: hypertension control in the general population to reach the WHO target of 150 million people controlled by 2030; 80% blood pressure control among people with diabetes by 2030; 50% statin coverage among eligible adults aged 40 years or older by 2030; and a combined scenario. The primary outcome was cumulative CVD deaths averted during 2026 - 2050.</w:t>
       </w:r>
     </w:p>
     <w:p>
@@ -150,7 +150,7 @@
         <w:pStyle w:val="BodyText"/>
       </w:pPr>
       <w:r>
-        <w:t xml:space="preserve">Under business-as-usual, the model projected 696.2 million CVD deaths during 2025–2050. Compared with business-as-usual, achieving the general-population hypertension target was projected to avert 29.4 million deaths and 390.2 million DALYs, the diabetes-specific hypertension target 16.2 million deaths and 149.8 million DALYs, and the statin target 21.3 million deaths and 263.1 million DALYs. Achieving all three targets simultaneously was projected to avert 65.6 million CVD deaths and 787.0 million DALYs, equivalent to 9.4% of cumulative business-as-usual mortality.</w:t>
+        <w:t xml:space="preserve">Under business-as-usual, the model projected 696.2 million CVD deaths during 2026 - 2050. Compared with business-as-usual, achieving the general-population hypertension target was projected to avert 29.4 million deaths and 390.2 million DALYs, the diabetes-specific hypertension target 16.2 million deaths and 149.8 million DALYs, and the statin target 21.3 million deaths and 263.1 million DALYs. Achieving all three targets simultaneously was projected to avert 65.6 million CVD deaths and 787.0 million DALYs, equivalent to 9.4% of cumulative business-as-usual mortality.</w:t>
       </w:r>
     </w:p>
     <w:p>
@@ -1056,13 +1056,13 @@
         <w:pStyle w:val="FirstParagraph"/>
       </w:pPr>
       <w:r>
-        <w:t xml:space="preserve">The economic value of averted CVD mortality was estimated using two complementary metrics: the value of a statistical life (VSL) and the value of a statistical life year (VSLY). Both metrics quantify the monetary value that society places on small reductions in mortality risk and are recommended by guidelines for benefit–cost analysis of health interventions</w:t>
-      </w:r>
-      <w:r>
-        <w:t xml:space="preserve"> </w:t>
-      </w:r>
-      <w:r>
-        <w:t xml:space="preserve">(Robinson, Hammitt, and O’Keeffe 2019)</w:t>
+        <w:t xml:space="preserve">The economic value of averted CVD mortality was estimated using the value of a statistical life year (VSLY). This metric quantifies the monetary value that society places on marginal reductions in mortality risk and is recommended in guidelines for benefit–cost analyses of health interventions, particularly those targeting age-specific populations such as adults</w:t>
+      </w:r>
+      <w:r>
+        <w:t xml:space="preserve"> </w:t>
+      </w:r>
+      <w:r>
+        <w:t xml:space="preserve">(Robinson, Hammitt, and O’Keeffe 2019; Robinson et al. 2019)</w:t>
       </w:r>
       <w:r>
         <w:t xml:space="preserve">.</w:t>
@@ -1073,7 +1073,7 @@
         <w:pStyle w:val="BodyText"/>
       </w:pPr>
       <w:r>
-        <w:t xml:space="preserve">Country-specific VSL values were derived by transferring a United States reference VSL to each country using gross national income (GNI) per capita at purchasing power parity (PPP) and an income elasticity. Following Robinson et al.</w:t>
+        <w:t xml:space="preserve">Country-specific VSLY values were derived by transferring a United States reference VSL to each country using gross national income (GNI) per capita at purchasing power parity (PPP) and an income elasticity. Following Robinson et al.</w:t>
       </w:r>
       <w:r>
         <w:t xml:space="preserve"> </w:t>
@@ -1082,7 +1082,16 @@
         <w:t xml:space="preserve">(2019)</w:t>
       </w:r>
       <w:r>
-        <w:t xml:space="preserve">, the primary estimate used a differential income elasticity of 0.8 for countries at or above US income and 1.2 for countries below. A uniform elasticity of 1.5 was used as a sensitivity bound. GNI per capita was obtained from the World Bank and projected beyond the last observed year using SSP2 GDP growth rates from IIASA SSP 3.1.</w:t>
+        <w:t xml:space="preserve">, the primary estimate used a differential income elasticity of 0.8 for countries at or above US income and 1.2 for countries below. A uniform elasticity of 1.5 was used as a sensitivity bound. GNI per capita was obtained from the World Bank and projected beyond the last observed year using SSP2 GDP growth rates from IIASA SSP 3.1</w:t>
+      </w:r>
+      <w:r>
+        <w:t xml:space="preserve"> </w:t>
+      </w:r>
+      <w:r>
+        <w:t xml:space="preserve">(IIASA Energy, Climate, and Environment (ECE) Program 2024)</w:t>
+      </w:r>
+      <w:r>
+        <w:t xml:space="preserve">.</w:t>
       </w:r>
     </w:p>
     <w:p>
@@ -1313,7 +1322,16 @@
         <w:t xml:space="preserve"> </w:t>
       </w:r>
       <w:r>
-        <w:t xml:space="preserve">GNI per capita) to facilitate cross-country comparison. Full mathematical details are provided in the Supplemental Material (see Economic Valuation Methods).</w:t>
+        <w:t xml:space="preserve">GNI per capita) to facilitate cross-country comparison. A similar reporting approach has been used in prior studies</w:t>
+      </w:r>
+      <w:r>
+        <w:t xml:space="preserve"> </w:t>
+      </w:r>
+      <w:r>
+        <w:t xml:space="preserve">(Verguet et al. 2024; Chang et al. 2024)</w:t>
+      </w:r>
+      <w:r>
+        <w:t xml:space="preserve">. Full mathematical details are provided in the Supplemental Material (see Economic Valuation Methods).</w:t>
       </w:r>
     </w:p>
     <w:bookmarkEnd w:id="33"/>
@@ -1395,7 +1413,7 @@
         <w:pStyle w:val="FirstParagraph"/>
       </w:pPr>
       <w:r>
-        <w:t xml:space="preserve">Achievement of the WHO target for hypertension control in the general population was projected to avert 29.4 million CVD deaths during 2025–2050, equivalent to 4.2% of cumulative BAU mortality (Table 1; Supplemental Figure</w:t>
+        <w:t xml:space="preserve">Achievement of the WHO target for hypertension control in the general population was projected to avert 29.4 million CVD deaths during 2026-2050, equivalent to 4.2% of cumulative BAU mortality (Table 1; Supplemental Figure</w:t>
       </w:r>
       <w:r>
         <w:t xml:space="preserve"> </w:t>
@@ -1421,7 +1439,7 @@
         <w:pStyle w:val="BodyText"/>
       </w:pPr>
       <w:r>
-        <w:t xml:space="preserve">Targeted hypertension control among people with diabetes, assuming scale-up to 80% control by 2030, was projected to avert a further 16.2 million deaths, corresponding to 2.3% of cumulative BAU mortality, and 149.8 million DALYs during 2025–2050. These gains reflect the higher underlying cardiovascular risk in this subgroup and the greater absolute benefit associated with improved blood pressure control.</w:t>
+        <w:t xml:space="preserve">Targeted hypertension control among people with diabetes, assuming scale-up to 80% control by 2030, was projected to avert a further 16.2 million deaths, corresponding to 2.3% of cumulative BAU mortality, and 149.8 million DALYs during 2026-2050. These gains reflect the higher underlying cardiovascular risk in this subgroup and the greater absolute benefit associated with improved blood pressure control.</w:t>
       </w:r>
     </w:p>
     <w:bookmarkEnd w:id="36"/>
@@ -1448,7 +1466,7 @@
         <w:pStyle w:val="FirstParagraph"/>
       </w:pPr>
       <w:r>
-        <w:t xml:space="preserve">Scale-up of lipid-lowering therapy to 50% coverage among eligible adults by 2030 was projected to avert 21.3 million deaths during 2025–2050, equivalent to 3.1% of cumulative BAU mortality (Table 1). Because statin effects were restricted to ischaemic heart disease and ischaemic stroke, the distribution of averted deaths differed from that in the hypertension scenarios: 20.8 million deaths averted were attributable to reductions in ischaemic heart disease and 1.5 million to reductions in ischaemic stroke (Table 2). The temporal pattern of benefit was similar to that of hypertension control, with gains increasing after 2030 as sustained treatment coverage translated into cumulative reductions in cardiovascular risk (Supplemental Figure</w:t>
+        <w:t xml:space="preserve">Scale-up of lipid-lowering therapy to 50% coverage among eligible adults by 2030 was projected to avert 21.3 million deaths during 2026-2050, equivalent to 3.1% of cumulative BAU mortality (Table 1). Because statin effects were restricted to ischaemic heart disease and ischaemic stroke, the distribution of averted deaths differed from that in the hypertension scenarios: 20.8 million deaths averted were attributable to reductions in ischaemic heart disease and 1.5 million to reductions in ischaemic stroke (Table 2). The temporal pattern of benefit was similar to that of hypertension control, with gains increasing after 2030 as sustained treatment coverage translated into cumulative reductions in cardiovascular risk (Supplemental Figure</w:t>
       </w:r>
       <w:r>
         <w:t xml:space="preserve"> </w:t>
@@ -1484,7 +1502,7 @@
         <w:pStyle w:val="FirstParagraph"/>
       </w:pPr>
       <w:r>
-        <w:t xml:space="preserve">Simultaneous achievement of all three WHO targets was projected to avert 65.6 million CVD deaths during 2025–2050, representing 9.4% of cumulative BAU mortality (Table 1; Supplemental Figure</w:t>
+        <w:t xml:space="preserve">Simultaneous achievement of all three WHO targets was projected to avert 65.6 million CVD deaths during 2026-2050, representing 9.4% of cumulative BAU mortality (Table 1; Supplemental Figure</w:t>
       </w:r>
       <w:r>
         <w:t xml:space="preserve"> </w:t>
@@ -2255,7 +2273,7 @@
       </w:r>
     </w:p>
     <w:bookmarkEnd w:id="53"/>
-    <w:bookmarkStart w:id="106" w:name="references"/>
+    <w:bookmarkStart w:id="114" w:name="references"/>
     <w:p>
       <w:pPr>
         <w:pStyle w:val="Heading1"/>
@@ -2273,7 +2291,7 @@
         <w:t xml:space="preserve">References</w:t>
       </w:r>
     </w:p>
-    <w:bookmarkStart w:id="105" w:name="refs"/>
+    <w:bookmarkStart w:id="113" w:name="refs"/>
     <w:bookmarkStart w:id="54" w:name="ref-Agboyibor2025CVHWHOAfrica"/>
     <w:p>
       <w:pPr>
@@ -2494,7 +2512,53 @@
       </w:r>
     </w:p>
     <w:bookmarkEnd w:id="61"/>
-    <w:bookmarkStart w:id="63" w:name="ref-Chong2024"/>
+    <w:bookmarkStart w:id="63" w:name="ref-Chang2024ECValue"/>
+    <w:p>
+      <w:pPr>
+        <w:pStyle w:val="Bibliography"/>
+      </w:pPr>
+      <w:r>
+        <w:t xml:space="preserve">Chang, Angela Y., Gretchen A. Stevens, Diego S. Cardoso, Bochen Cao, and Dean T. Jamison. 2024.</w:t>
+      </w:r>
+      <w:r>
+        <w:t xml:space="preserve"> </w:t>
+      </w:r>
+      <w:r>
+        <w:t xml:space="preserve">“The Economic Value of Reducing Avoidable Mortality.”</w:t>
+      </w:r>
+      <w:r>
+        <w:t xml:space="preserve"> </w:t>
+      </w:r>
+      <w:r>
+        <w:rPr>
+          <w:i/>
+          <w:iCs/>
+        </w:rPr>
+        <w:t xml:space="preserve">Nature Medicine 2024 30:11</w:t>
+      </w:r>
+      <w:r>
+        <w:t xml:space="preserve"> </w:t>
+      </w:r>
+      <w:r>
+        <w:t xml:space="preserve">30 (September): 3327–34.</w:t>
+      </w:r>
+      <w:r>
+        <w:t xml:space="preserve"> </w:t>
+      </w:r>
+      <w:hyperlink r:id="rId62">
+        <w:r>
+          <w:rPr>
+            <w:rStyle w:val="Hyperlink"/>
+          </w:rPr>
+          <w:t xml:space="preserve">https://doi.org/10.1038/s41591-024-03253-7</w:t>
+        </w:r>
+      </w:hyperlink>
+      <w:r>
+        <w:t xml:space="preserve">.</w:t>
+      </w:r>
+    </w:p>
+    <w:bookmarkEnd w:id="63"/>
+    <w:bookmarkStart w:id="65" w:name="ref-Chong2024"/>
     <w:p>
       <w:pPr>
         <w:pStyle w:val="Bibliography"/>
@@ -2524,7 +2588,7 @@
       <w:r>
         <w:t xml:space="preserve"> </w:t>
       </w:r>
-      <w:hyperlink r:id="rId62">
+      <w:hyperlink r:id="rId64">
         <w:r>
           <w:rPr>
             <w:rStyle w:val="Hyperlink"/>
@@ -2536,8 +2600,8 @@
         <w:t xml:space="preserve">.</w:t>
       </w:r>
     </w:p>
-    <w:bookmarkEnd w:id="63"/>
-    <w:bookmarkStart w:id="65" w:name="ref-Critchley2004"/>
+    <w:bookmarkEnd w:id="65"/>
+    <w:bookmarkStart w:id="67" w:name="ref-Critchley2004"/>
     <w:p>
       <w:pPr>
         <w:pStyle w:val="Bibliography"/>
@@ -2570,7 +2634,7 @@
       <w:r>
         <w:t xml:space="preserve"> </w:t>
       </w:r>
-      <w:hyperlink r:id="rId64">
+      <w:hyperlink r:id="rId66">
         <w:r>
           <w:rPr>
             <w:rStyle w:val="Hyperlink"/>
@@ -2582,8 +2646,8 @@
         <w:t xml:space="preserve">.</w:t>
       </w:r>
     </w:p>
-    <w:bookmarkEnd w:id="65"/>
-    <w:bookmarkStart w:id="67" w:name="ref-Ettehad2016"/>
+    <w:bookmarkEnd w:id="67"/>
+    <w:bookmarkStart w:id="69" w:name="ref-Ettehad2016"/>
     <w:p>
       <w:pPr>
         <w:pStyle w:val="Bibliography"/>
@@ -2616,7 +2680,7 @@
       <w:r>
         <w:t xml:space="preserve"> </w:t>
       </w:r>
-      <w:hyperlink r:id="rId66">
+      <w:hyperlink r:id="rId68">
         <w:r>
           <w:rPr>
             <w:rStyle w:val="Hyperlink"/>
@@ -2628,8 +2692,8 @@
         <w:t xml:space="preserve">.</w:t>
       </w:r>
     </w:p>
-    <w:bookmarkEnd w:id="67"/>
-    <w:bookmarkStart w:id="69" w:name="ref-Ford2007"/>
+    <w:bookmarkEnd w:id="69"/>
+    <w:bookmarkStart w:id="71" w:name="ref-Ford2007"/>
     <w:p>
       <w:pPr>
         <w:pStyle w:val="Bibliography"/>
@@ -2662,7 +2726,7 @@
       <w:r>
         <w:t xml:space="preserve"> </w:t>
       </w:r>
-      <w:hyperlink r:id="rId68">
+      <w:hyperlink r:id="rId70">
         <w:r>
           <w:rPr>
             <w:rStyle w:val="Hyperlink"/>
@@ -2674,8 +2738,8 @@
         <w:t xml:space="preserve">.</w:t>
       </w:r>
     </w:p>
-    <w:bookmarkEnd w:id="69"/>
-    <w:bookmarkStart w:id="71" w:name="ref-Fulcher2015"/>
+    <w:bookmarkEnd w:id="71"/>
+    <w:bookmarkStart w:id="73" w:name="ref-Fulcher2015"/>
     <w:p>
       <w:pPr>
         <w:pStyle w:val="Bibliography"/>
@@ -2708,7 +2772,7 @@
       <w:r>
         <w:t xml:space="preserve"> </w:t>
       </w:r>
-      <w:hyperlink r:id="rId70">
+      <w:hyperlink r:id="rId72">
         <w:r>
           <w:rPr>
             <w:rStyle w:val="Hyperlink"/>
@@ -2720,8 +2784,8 @@
         <w:t xml:space="preserve">.</w:t>
       </w:r>
     </w:p>
-    <w:bookmarkEnd w:id="71"/>
-    <w:bookmarkStart w:id="73" w:name="ref-Garcia2026HEARTS4Countries"/>
+    <w:bookmarkEnd w:id="73"/>
+    <w:bookmarkStart w:id="75" w:name="ref-Garcia2026HEARTS4Countries"/>
     <w:p>
       <w:pPr>
         <w:pStyle w:val="Bibliography"/>
@@ -2751,7 +2815,7 @@
       <w:r>
         <w:t xml:space="preserve">5: 102412. https://doi.org/</w:t>
       </w:r>
-      <w:hyperlink r:id="rId72">
+      <w:hyperlink r:id="rId74">
         <w:r>
           <w:rPr>
             <w:rStyle w:val="Hyperlink"/>
@@ -2763,8 +2827,8 @@
         <w:t xml:space="preserve">.</w:t>
       </w:r>
     </w:p>
-    <w:bookmarkEnd w:id="73"/>
-    <w:bookmarkStart w:id="74" w:name="ref-GBDCVD2025"/>
+    <w:bookmarkEnd w:id="75"/>
+    <w:bookmarkStart w:id="76" w:name="ref-GBDCVD2025"/>
     <w:p>
       <w:pPr>
         <w:pStyle w:val="Bibliography"/>
@@ -2795,8 +2859,8 @@
         <w:t xml:space="preserve">86 (22): 2167–2243.</w:t>
       </w:r>
     </w:p>
-    <w:bookmarkEnd w:id="74"/>
-    <w:bookmarkStart w:id="75" w:name="ref-Geldsetzer2019HypertensionCareLMICs"/>
+    <w:bookmarkEnd w:id="76"/>
+    <w:bookmarkStart w:id="77" w:name="ref-Geldsetzer2019HypertensionCareLMICs"/>
     <w:p>
       <w:pPr>
         <w:pStyle w:val="Bibliography"/>
@@ -2827,8 +2891,8 @@
         <w:t xml:space="preserve">394 (10199): 652–62.</w:t>
       </w:r>
     </w:p>
-    <w:bookmarkEnd w:id="75"/>
-    <w:bookmarkStart w:id="77" w:name="ref-ConsortiumRisk2023"/>
+    <w:bookmarkEnd w:id="77"/>
+    <w:bookmarkStart w:id="79" w:name="ref-ConsortiumRisk2023"/>
     <w:p>
       <w:pPr>
         <w:pStyle w:val="Bibliography"/>
@@ -2861,7 +2925,7 @@
       <w:r>
         <w:t xml:space="preserve"> </w:t>
       </w:r>
-      <w:hyperlink r:id="rId76">
+      <w:hyperlink r:id="rId78">
         <w:r>
           <w:rPr>
             <w:rStyle w:val="Hyperlink"/>
@@ -2873,8 +2937,8 @@
         <w:t xml:space="preserve">.</w:t>
       </w:r>
     </w:p>
-    <w:bookmarkEnd w:id="77"/>
-    <w:bookmarkStart w:id="78" w:name="ref-Gregg2023DiabetesCompactTargets"/>
+    <w:bookmarkEnd w:id="79"/>
+    <w:bookmarkStart w:id="80" w:name="ref-Gregg2023DiabetesCompactTargets"/>
     <w:p>
       <w:pPr>
         <w:pStyle w:val="Bibliography"/>
@@ -2905,8 +2969,8 @@
         <w:t xml:space="preserve">401 (10384): 1302–12.</w:t>
       </w:r>
     </w:p>
-    <w:bookmarkEnd w:id="78"/>
-    <w:bookmarkStart w:id="79" w:name="ref-Hunt2021GlobalDiabetesCompact"/>
+    <w:bookmarkEnd w:id="80"/>
+    <w:bookmarkStart w:id="81" w:name="ref-Hunt2021GlobalDiabetesCompact"/>
     <w:p>
       <w:pPr>
         <w:pStyle w:val="Bibliography"/>
@@ -2937,8 +3001,38 @@
         <w:t xml:space="preserve">9 (6): 325–27.</w:t>
       </w:r>
     </w:p>
-    <w:bookmarkEnd w:id="79"/>
-    <w:bookmarkStart w:id="80" w:name="Xc6e08a70bb154acc484bdd41af662cc6d9fe479"/>
+    <w:bookmarkEnd w:id="81"/>
+    <w:bookmarkStart w:id="83" w:name="ref-IIASA2024Gdp31"/>
+    <w:p>
+      <w:pPr>
+        <w:pStyle w:val="Bibliography"/>
+      </w:pPr>
+      <w:r>
+        <w:t xml:space="preserve">IIASA Energy, Climate, and Environment (ECE) Program. 2024.</w:t>
+      </w:r>
+      <w:r>
+        <w:t xml:space="preserve"> </w:t>
+      </w:r>
+      <w:r>
+        <w:t xml:space="preserve">“Shared Socioeconomic Pathways (SSP) Database, Release 3.1: Basic Drivers (GDP and Population).”</w:t>
+      </w:r>
+      <w:r>
+        <w:t xml:space="preserve"> </w:t>
+      </w:r>
+      <w:hyperlink r:id="rId82">
+        <w:r>
+          <w:rPr>
+            <w:rStyle w:val="Hyperlink"/>
+          </w:rPr>
+          <w:t xml:space="preserve">https://ssp.apps.ece.iiasa.ac.at/documentation/basic-drivers</w:t>
+        </w:r>
+      </w:hyperlink>
+      <w:r>
+        <w:t xml:space="preserve">.</w:t>
+      </w:r>
+    </w:p>
+    <w:bookmarkEnd w:id="83"/>
+    <w:bookmarkStart w:id="84" w:name="Xc6e08a70bb154acc484bdd41af662cc6d9fe479"/>
     <w:p>
       <w:pPr>
         <w:pStyle w:val="Bibliography"/>
@@ -2969,8 +3063,8 @@
         <w:t xml:space="preserve">10 (3): 224–33.</w:t>
       </w:r>
     </w:p>
-    <w:bookmarkEnd w:id="80"/>
-    <w:bookmarkStart w:id="82" w:name="ref-Kontis2019"/>
+    <w:bookmarkEnd w:id="84"/>
+    <w:bookmarkStart w:id="86" w:name="ref-Kontis2019"/>
     <w:p>
       <w:pPr>
         <w:pStyle w:val="Bibliography"/>
@@ -3003,7 +3097,7 @@
       <w:r>
         <w:t xml:space="preserve"> </w:t>
       </w:r>
-      <w:hyperlink r:id="rId81">
+      <w:hyperlink r:id="rId85">
         <w:r>
           <w:rPr>
             <w:rStyle w:val="Hyperlink"/>
@@ -3015,8 +3109,8 @@
         <w:t xml:space="preserve">.</w:t>
       </w:r>
     </w:p>
-    <w:bookmarkEnd w:id="82"/>
-    <w:bookmarkStart w:id="83" w:name="ref-Li2024HyperlipidemiaMedicinesAccess"/>
+    <w:bookmarkEnd w:id="86"/>
+    <w:bookmarkStart w:id="87" w:name="ref-Li2024HyperlipidemiaMedicinesAccess"/>
     <w:p>
       <w:pPr>
         <w:pStyle w:val="Bibliography"/>
@@ -3047,8 +3141,8 @@
         <w:t xml:space="preserve">4 (2): e0002905.</w:t>
       </w:r>
     </w:p>
-    <w:bookmarkEnd w:id="83"/>
-    <w:bookmarkStart w:id="84" w:name="ref-Li2024DiabetesCVDTargetsLMICs"/>
+    <w:bookmarkEnd w:id="87"/>
+    <w:bookmarkStart w:id="88" w:name="ref-Li2024DiabetesCVDTargetsLMICs"/>
     <w:p>
       <w:pPr>
         <w:pStyle w:val="Bibliography"/>
@@ -3079,8 +3173,8 @@
         <w:t xml:space="preserve">14: 04148.</w:t>
       </w:r>
     </w:p>
-    <w:bookmarkEnd w:id="84"/>
-    <w:bookmarkStart w:id="85" w:name="ref-Marcus2022StatinsLMICs"/>
+    <w:bookmarkEnd w:id="88"/>
+    <w:bookmarkStart w:id="89" w:name="ref-Marcus2022StatinsLMICs"/>
     <w:p>
       <w:pPr>
         <w:pStyle w:val="Bibliography"/>
@@ -3111,8 +3205,8 @@
         <w:t xml:space="preserve">10 (3): e369–79.</w:t>
       </w:r>
     </w:p>
-    <w:bookmarkEnd w:id="85"/>
-    <w:bookmarkStart w:id="86" w:name="ref-Mensah2023GlobalBurdenCVD"/>
+    <w:bookmarkEnd w:id="89"/>
+    <w:bookmarkStart w:id="90" w:name="ref-Mensah2023GlobalBurdenCVD"/>
     <w:p>
       <w:pPr>
         <w:pStyle w:val="Bibliography"/>
@@ -3143,8 +3237,8 @@
         <w:t xml:space="preserve">82 (25): 2350–2473.</w:t>
       </w:r>
     </w:p>
-    <w:bookmarkEnd w:id="86"/>
-    <w:bookmarkStart w:id="88" w:name="ref-Moran2024"/>
+    <w:bookmarkEnd w:id="90"/>
+    <w:bookmarkStart w:id="92" w:name="ref-Moran2024"/>
     <w:p>
       <w:pPr>
         <w:pStyle w:val="Bibliography"/>
@@ -3177,7 +3271,7 @@
       <w:r>
         <w:t xml:space="preserve"> </w:t>
       </w:r>
-      <w:hyperlink r:id="rId87">
+      <w:hyperlink r:id="rId91">
         <w:r>
           <w:rPr>
             <w:rStyle w:val="Hyperlink"/>
@@ -3189,8 +3283,8 @@
         <w:t xml:space="preserve">.</w:t>
       </w:r>
     </w:p>
-    <w:bookmarkEnd w:id="88"/>
-    <w:bookmarkStart w:id="89" w:name="ref-Moran2023GlobalHEARTSImplementation"/>
+    <w:bookmarkEnd w:id="92"/>
+    <w:bookmarkStart w:id="93" w:name="ref-Moran2023GlobalHEARTSImplementation"/>
     <w:p>
       <w:pPr>
         <w:pStyle w:val="Bibliography"/>
@@ -3221,8 +3315,8 @@
         <w:t xml:space="preserve">82 (19): 1868–84.</w:t>
       </w:r>
     </w:p>
-    <w:bookmarkEnd w:id="89"/>
-    <w:bookmarkStart w:id="90" w:name="ref-Nambiema2025HypertensionAfrica"/>
+    <w:bookmarkEnd w:id="93"/>
+    <w:bookmarkStart w:id="94" w:name="ref-Nambiema2025HypertensionAfrica"/>
     <w:p>
       <w:pPr>
         <w:pStyle w:val="Bibliography"/>
@@ -3253,8 +3347,8 @@
         <w:t xml:space="preserve">86 (23): 2263–88.</w:t>
       </w:r>
     </w:p>
-    <w:bookmarkEnd w:id="90"/>
-    <w:bookmarkStart w:id="91" w:name="ref-NCDCountdown2025BenchmarkingProgress"/>
+    <w:bookmarkEnd w:id="94"/>
+    <w:bookmarkStart w:id="95" w:name="ref-NCDCountdown2025BenchmarkingProgress"/>
     <w:p>
       <w:pPr>
         <w:pStyle w:val="Bibliography"/>
@@ -3285,8 +3379,8 @@
         <w:t xml:space="preserve">406 (10509): 1255–82.</w:t>
       </w:r>
     </w:p>
-    <w:bookmarkEnd w:id="91"/>
-    <w:bookmarkStart w:id="92" w:name="ref-Petty1999IschemicStrokeSubtypes"/>
+    <w:bookmarkEnd w:id="95"/>
+    <w:bookmarkStart w:id="96" w:name="ref-Petty1999IschemicStrokeSubtypes"/>
     <w:p>
       <w:pPr>
         <w:pStyle w:val="Bibliography"/>
@@ -3317,8 +3411,8 @@
         <w:t xml:space="preserve">30 (12): 2513–16.</w:t>
       </w:r>
     </w:p>
-    <w:bookmarkEnd w:id="92"/>
-    <w:bookmarkStart w:id="94" w:name="ref-Pickersgill2022"/>
+    <w:bookmarkEnd w:id="96"/>
+    <w:bookmarkStart w:id="98" w:name="ref-Pickersgill2022"/>
     <w:p>
       <w:pPr>
         <w:pStyle w:val="Bibliography"/>
@@ -3351,7 +3445,7 @@
       <w:r>
         <w:t xml:space="preserve"> </w:t>
       </w:r>
-      <w:hyperlink r:id="rId93">
+      <w:hyperlink r:id="rId97">
         <w:r>
           <w:rPr>
             <w:rStyle w:val="Hyperlink"/>
@@ -3363,8 +3457,8 @@
         <w:t xml:space="preserve">.</w:t>
       </w:r>
     </w:p>
-    <w:bookmarkEnd w:id="94"/>
-    <w:bookmarkStart w:id="95" w:name="ref-Reith2026StatinAdverseEffects"/>
+    <w:bookmarkEnd w:id="98"/>
+    <w:bookmarkStart w:id="99" w:name="ref-Reith2026StatinAdverseEffects"/>
     <w:p>
       <w:pPr>
         <w:pStyle w:val="Bibliography"/>
@@ -3395,8 +3489,51 @@
         <w:t xml:space="preserve">407 (10529): 689–703.</w:t>
       </w:r>
     </w:p>
-    <w:bookmarkEnd w:id="95"/>
-    <w:bookmarkStart w:id="97" w:name="ref-Robinson2019VSL"/>
+    <w:bookmarkEnd w:id="99"/>
+    <w:bookmarkStart w:id="101" w:name="ref-Robinson19BCA"/>
+    <w:p>
+      <w:pPr>
+        <w:pStyle w:val="Bibliography"/>
+      </w:pPr>
+      <w:r>
+        <w:t xml:space="preserve">Robinson, Lisa A., James K. Hammitt, Michele Cecchini, Kalipso Chalkidou, Karl Claxton, Maureen Cropper, Patrick Hoang-Vu Eozenou, et al. 2019.</w:t>
+      </w:r>
+      <w:r>
+        <w:t xml:space="preserve"> </w:t>
+      </w:r>
+      <w:r>
+        <w:t xml:space="preserve">“Reference Case Guidelines for Benefit-Cost Analysis in Global Health and Development.”</w:t>
+      </w:r>
+      <w:r>
+        <w:t xml:space="preserve"> </w:t>
+      </w:r>
+      <w:r>
+        <w:rPr>
+          <w:i/>
+          <w:iCs/>
+        </w:rPr>
+        <w:t xml:space="preserve">SSRN Electronic Journal</w:t>
+      </w:r>
+      <w:r>
+        <w:t xml:space="preserve">, May.</w:t>
+      </w:r>
+      <w:r>
+        <w:t xml:space="preserve"> </w:t>
+      </w:r>
+      <w:hyperlink r:id="rId100">
+        <w:r>
+          <w:rPr>
+            <w:rStyle w:val="Hyperlink"/>
+          </w:rPr>
+          <w:t xml:space="preserve">https://doi.org/10.2139/SSRN.4015886</w:t>
+        </w:r>
+      </w:hyperlink>
+      <w:r>
+        <w:t xml:space="preserve">.</w:t>
+      </w:r>
+    </w:p>
+    <w:bookmarkEnd w:id="101"/>
+    <w:bookmarkStart w:id="103" w:name="ref-Robinson2019VSL"/>
     <w:p>
       <w:pPr>
         <w:pStyle w:val="Bibliography"/>
@@ -3429,7 +3566,7 @@
       <w:r>
         <w:t xml:space="preserve"> </w:t>
       </w:r>
-      <w:hyperlink r:id="rId96">
+      <w:hyperlink r:id="rId102">
         <w:r>
           <w:rPr>
             <w:rStyle w:val="Hyperlink"/>
@@ -3441,8 +3578,8 @@
         <w:t xml:space="preserve">.</w:t>
       </w:r>
     </w:p>
-    <w:bookmarkEnd w:id="97"/>
-    <w:bookmarkStart w:id="98" w:name="ref-Lancet2025TurnTideNCDs"/>
+    <w:bookmarkEnd w:id="103"/>
+    <w:bookmarkStart w:id="104" w:name="ref-Lancet2025TurnTideNCDs"/>
     <w:p>
       <w:pPr>
         <w:pStyle w:val="Bibliography"/>
@@ -3473,8 +3610,54 @@
         <w:t xml:space="preserve">405 (10472): 1.</w:t>
       </w:r>
     </w:p>
-    <w:bookmarkEnd w:id="98"/>
-    <w:bookmarkStart w:id="100" w:name="ref-Vollset2024"/>
+    <w:bookmarkEnd w:id="104"/>
+    <w:bookmarkStart w:id="106" w:name="ref-Verguet2024ECValue"/>
+    <w:p>
+      <w:pPr>
+        <w:pStyle w:val="Bibliography"/>
+      </w:pPr>
+      <w:r>
+        <w:t xml:space="preserve">Verguet, Stéphane, Sarah Bolongaita, Angela Y. Chang, Diego S. Cardoso, and Gretchen A. Stevens. 2024.</w:t>
+      </w:r>
+      <w:r>
+        <w:t xml:space="preserve"> </w:t>
+      </w:r>
+      <w:r>
+        <w:t xml:space="preserve">“The Economic Value of Reducing Mortality Due to Noncommunicable Diseases and Injuries.”</w:t>
+      </w:r>
+      <w:r>
+        <w:t xml:space="preserve"> </w:t>
+      </w:r>
+      <w:r>
+        <w:rPr>
+          <w:i/>
+          <w:iCs/>
+        </w:rPr>
+        <w:t xml:space="preserve">Nature Medicine 2024 30:11</w:t>
+      </w:r>
+      <w:r>
+        <w:t xml:space="preserve"> </w:t>
+      </w:r>
+      <w:r>
+        <w:t xml:space="preserve">30 (September): 3335–44.</w:t>
+      </w:r>
+      <w:r>
+        <w:t xml:space="preserve"> </w:t>
+      </w:r>
+      <w:hyperlink r:id="rId105">
+        <w:r>
+          <w:rPr>
+            <w:rStyle w:val="Hyperlink"/>
+          </w:rPr>
+          <w:t xml:space="preserve">https://doi.org/10.1038/s41591-024-03248-4</w:t>
+        </w:r>
+      </w:hyperlink>
+      <w:r>
+        <w:t xml:space="preserve">.</w:t>
+      </w:r>
+    </w:p>
+    <w:bookmarkEnd w:id="106"/>
+    <w:bookmarkStart w:id="108" w:name="ref-Vollset2024"/>
     <w:p>
       <w:pPr>
         <w:pStyle w:val="Bibliography"/>
@@ -3507,7 +3690,7 @@
       <w:r>
         <w:t xml:space="preserve"> </w:t>
       </w:r>
-      <w:hyperlink r:id="rId99">
+      <w:hyperlink r:id="rId107">
         <w:r>
           <w:rPr>
             <w:rStyle w:val="Hyperlink"/>
@@ -3519,8 +3702,8 @@
         <w:t xml:space="preserve">.</w:t>
       </w:r>
     </w:p>
-    <w:bookmarkEnd w:id="100"/>
-    <w:bookmarkStart w:id="102" w:name="ref-Watkins2022NCD2030"/>
+    <w:bookmarkEnd w:id="108"/>
+    <w:bookmarkStart w:id="110" w:name="ref-Watkins2022NCD2030"/>
     <w:p>
       <w:pPr>
         <w:pStyle w:val="Bibliography"/>
@@ -3553,7 +3736,7 @@
       <w:r>
         <w:t xml:space="preserve"> </w:t>
       </w:r>
-      <w:hyperlink r:id="rId101">
+      <w:hyperlink r:id="rId109">
         <w:r>
           <w:rPr>
             <w:rStyle w:val="Hyperlink"/>
@@ -3565,8 +3748,8 @@
         <w:t xml:space="preserve">.</w:t>
       </w:r>
     </w:p>
-    <w:bookmarkEnd w:id="102"/>
-    <w:bookmarkStart w:id="103" w:name="ref-WHO2011NCDMonitoringFramework"/>
+    <w:bookmarkEnd w:id="110"/>
+    <w:bookmarkStart w:id="111" w:name="ref-WHO2011NCDMonitoringFramework"/>
     <w:p>
       <w:pPr>
         <w:pStyle w:val="Bibliography"/>
@@ -3587,8 +3770,8 @@
         <w:t xml:space="preserve">World Health Organization.</w:t>
       </w:r>
     </w:p>
-    <w:bookmarkEnd w:id="103"/>
-    <w:bookmarkStart w:id="104" w:name="ref-WHO2025HypertensionReport"/>
+    <w:bookmarkEnd w:id="111"/>
+    <w:bookmarkStart w:id="112" w:name="ref-WHO2025HypertensionReport"/>
     <w:p>
       <w:pPr>
         <w:pStyle w:val="Bibliography"/>
@@ -3610,15 +3793,15 @@
         <w:t xml:space="preserve">. World Health Organization.</w:t>
       </w:r>
     </w:p>
-    <w:bookmarkEnd w:id="104"/>
-    <w:bookmarkEnd w:id="105"/>
+    <w:bookmarkEnd w:id="112"/>
+    <w:bookmarkEnd w:id="113"/>
     <w:p>
       <w:r>
         <w:br w:type="page"/>
       </w:r>
     </w:p>
-    <w:bookmarkEnd w:id="106"/>
-    <w:bookmarkStart w:id="107" w:name="tables"/>
+    <w:bookmarkEnd w:id="114"/>
+    <w:bookmarkStart w:id="115" w:name="tables"/>
     <w:p>
       <w:pPr>
         <w:pStyle w:val="Heading1"/>
@@ -3651,7 +3834,7 @@
         <w:t xml:space="preserve"> </w:t>
       </w:r>
       <w:r>
-        <w:t xml:space="preserve">Cumulative CVD deaths averted by intervention scenario, 2025–2050.</w:t>
+        <w:t xml:space="preserve">Cumulative CVD deaths averted by intervention scenario, 2026-2050.</w:t>
       </w:r>
     </w:p>
     <w:tbl>
@@ -3953,7 +4136,7 @@
         <w:t xml:space="preserve"> </w:t>
       </w:r>
       <w:r>
-        <w:t xml:space="preserve">Cumulative CVD deaths averted by intervention scenario and cause of death (millions), 2025–2050.</w:t>
+        <w:t xml:space="preserve">Cumulative CVD deaths averted by intervention scenario and cause of death (millions), 2026-2050.</w:t>
       </w:r>
     </w:p>
     <w:tbl>
@@ -4330,7 +4513,7 @@
         <w:t xml:space="preserve"> </w:t>
       </w:r>
       <w:r>
-        <w:t xml:space="preserve">Cumulative burden of disease averted by intervention scenario (millions), 2025–2050.</w:t>
+        <w:t xml:space="preserve">Cumulative burden of disease averted by intervention scenario (millions), 2026-2050.</w:t>
       </w:r>
     </w:p>
     <w:tbl>
@@ -4692,7 +4875,7 @@
         <w:t xml:space="preserve"> </w:t>
       </w:r>
       <w:r>
-        <w:t xml:space="preserve">Cumulative CVD deaths averted by WHO region under the combined intervention scenario, 2025–2050.</w:t>
+        <w:t xml:space="preserve">Cumulative CVD deaths averted by WHO region under the combined intervention scenario, 2026-2050.</w:t>
       </w:r>
     </w:p>
     <w:tbl>
@@ -5179,7 +5362,7 @@
         <w:t xml:space="preserve"> </w:t>
       </w:r>
       <w:r>
-        <w:t xml:space="preserve">Cumulative burden of disease averted by World Bank income group under the combined intervention scenario (millions), 2025–2050.</w:t>
+        <w:t xml:space="preserve">Cumulative burden of disease averted by World Bank income group under the combined intervention scenario (millions), 2026-2050.</w:t>
       </w:r>
     </w:p>
     <w:tbl>
@@ -5942,8 +6125,8 @@
         <w:br w:type="page"/>
       </w:r>
     </w:p>
-    <w:bookmarkEnd w:id="107"/>
-    <w:bookmarkStart w:id="116" w:name="figures"/>
+    <w:bookmarkEnd w:id="115"/>
+    <w:bookmarkStart w:id="124" w:name="figures"/>
     <w:p>
       <w:pPr>
         <w:pStyle w:val="Heading1"/>
@@ -5976,7 +6159,7 @@
         <w:t xml:space="preserve"> </w:t>
       </w:r>
       <w:r>
-        <w:t xml:space="preserve">Cumulative CVD deaths averted over time by intervention scenario, 2025–2050.</w:t>
+        <w:t xml:space="preserve">Cumulative CVD deaths averted over time by intervention scenario, 2026-2050.</w:t>
       </w:r>
     </w:p>
     <w:p>
@@ -5988,18 +6171,18 @@
           <wp:inline>
             <wp:extent cx="5334000" cy="2424545"/>
             <wp:effectExtent b="0" l="0" r="0" t="0"/>
-            <wp:docPr descr="Figure 9.1: Note: Lines represent the running total of deaths averted for each individual intervention relative to business-as-usual." title="" id="109" name="Picture"/>
+            <wp:docPr descr="Figure 9.1: Note: Lines represent the running total of deaths averted for each individual intervention relative to business-as-usual." title="" id="117" name="Picture"/>
             <a:graphic>
               <a:graphicData uri="http://schemas.openxmlformats.org/drawingml/2006/picture">
                 <pic:pic>
                   <pic:nvPicPr>
-                    <pic:cNvPr descr="../output/aim1_fig4_cum_averted.png" id="110" name="Picture"/>
+                    <pic:cNvPr descr="../output/aim1_fig4_cum_averted.png" id="118" name="Picture"/>
                     <pic:cNvPicPr>
                       <a:picLocks noChangeArrowheads="1" noChangeAspect="1"/>
                     </pic:cNvPicPr>
                   </pic:nvPicPr>
                   <pic:blipFill>
-                    <a:blip r:embed="rId108"/>
+                    <a:blip r:embed="rId116"/>
                     <a:stretch>
                       <a:fillRect/>
                     </a:stretch>
@@ -6030,8 +6213,8 @@
       <w:pPr>
         <w:pStyle w:val="ImageCaption"/>
       </w:pPr>
-      <w:bookmarkStart w:id="111" w:name="fig:fig4-paper"/>
-      <w:bookmarkEnd w:id="111"/>
+      <w:bookmarkStart w:id="119" w:name="fig:fig4-paper"/>
+      <w:bookmarkEnd w:id="119"/>
       <w:r>
         <w:t xml:space="preserve">Figure 9.1: Note: Lines represent the running total of deaths averted for each individual intervention relative to business-as-usual.</w:t>
       </w:r>
@@ -6056,7 +6239,7 @@
         <w:t xml:space="preserve"> </w:t>
       </w:r>
       <w:r>
-        <w:t xml:space="preserve">Distribution of projected CVD deaths averted by age group, sex, and intervention scenario, 2025–2050.</w:t>
+        <w:t xml:space="preserve">Distribution of projected CVD deaths averted by age group, sex, and intervention scenario, 2026-2050.</w:t>
       </w:r>
     </w:p>
     <w:p>
@@ -6068,18 +6251,18 @@
           <wp:inline>
             <wp:extent cx="5334000" cy="2667000"/>
             <wp:effectExtent b="0" l="0" r="0" t="0"/>
-            <wp:docPr descr="Figure 9.2: Note: Distribution of projected benefits by age and sex. Adults aged 70 years and older account for the majority of averted deaths across all interventions, consistent with the age-dependent increase in baseline CVD mortality." title="" id="113" name="Picture"/>
+            <wp:docPr descr="Figure 9.2: Note: Distribution of projected benefits by age and sex. Adults aged 70 years and older account for the majority of averted deaths across all interventions, consistent with the age-dependent increase in baseline CVD mortality." title="" id="121" name="Picture"/>
             <a:graphic>
               <a:graphicData uri="http://schemas.openxmlformats.org/drawingml/2006/picture">
                 <pic:pic>
                   <pic:nvPicPr>
-                    <pic:cNvPr descr="../output/aim1_fig5_demo_age.png" id="114" name="Picture"/>
+                    <pic:cNvPr descr="../output/aim1_fig5_demo_age.png" id="122" name="Picture"/>
                     <pic:cNvPicPr>
                       <a:picLocks noChangeArrowheads="1" noChangeAspect="1"/>
                     </pic:cNvPicPr>
                   </pic:nvPicPr>
                   <pic:blipFill>
-                    <a:blip r:embed="rId112"/>
+                    <a:blip r:embed="rId120"/>
                     <a:stretch>
                       <a:fillRect/>
                     </a:stretch>
@@ -6110,8 +6293,8 @@
       <w:pPr>
         <w:pStyle w:val="ImageCaption"/>
       </w:pPr>
-      <w:bookmarkStart w:id="115" w:name="fig:fig6-paper"/>
-      <w:bookmarkEnd w:id="115"/>
+      <w:bookmarkStart w:id="123" w:name="fig:fig6-paper"/>
+      <w:bookmarkEnd w:id="123"/>
       <w:r>
         <w:t xml:space="preserve">Figure 9.2: Note: Distribution of projected benefits by age and sex. Adults aged 70 years and older account for the majority of averted deaths across all interventions, consistent with the age-dependent increase in baseline CVD mortality.</w:t>
       </w:r>
@@ -6121,8 +6304,8 @@
         <w:br w:type="page"/>
       </w:r>
     </w:p>
-    <w:bookmarkEnd w:id="116"/>
-    <w:bookmarkStart w:id="173" w:name="supplemental-material"/>
+    <w:bookmarkEnd w:id="124"/>
+    <w:bookmarkStart w:id="181" w:name="supplemental-material"/>
     <w:p>
       <w:pPr>
         <w:pStyle w:val="Heading1"/>
@@ -6140,7 +6323,7 @@
         <w:t xml:space="preserve">Supplemental Material</w:t>
       </w:r>
     </w:p>
-    <w:bookmarkStart w:id="117" w:name="supplemental-tables"/>
+    <w:bookmarkStart w:id="125" w:name="supplemental-tables"/>
     <w:p>
       <w:pPr>
         <w:pStyle w:val="Heading2"/>
@@ -6198,8 +6381,8 @@
         <w:t xml:space="preserve">See Tables 4–5 for WHO region and World Bank income group breakdowns.</w:t>
       </w:r>
     </w:p>
-    <w:bookmarkEnd w:id="117"/>
-    <w:bookmarkStart w:id="153" w:name="supplemental-figures"/>
+    <w:bookmarkEnd w:id="125"/>
+    <w:bookmarkStart w:id="161" w:name="supplemental-figures"/>
     <w:p>
       <w:pPr>
         <w:pStyle w:val="Heading2"/>
@@ -6238,18 +6421,18 @@
           <wp:inline>
             <wp:extent cx="5334000" cy="2057400"/>
             <wp:effectExtent b="0" l="0" r="0" t="0"/>
-            <wp:docPr descr="" title="" id="119" name="Picture"/>
+            <wp:docPr descr="" title="" id="127" name="Picture"/>
             <a:graphic>
               <a:graphicData uri="http://schemas.openxmlformats.org/drawingml/2006/picture">
                 <pic:pic>
                   <pic:nvPicPr>
-                    <pic:cNvPr descr="who_cvd_targets_paper1_files/figure-docx/state-diagram-1.png" id="120" name="Picture"/>
+                    <pic:cNvPr descr="who_cvd_targets_paper1_files/figure-docx/state-diagram-1.png" id="128" name="Picture"/>
                     <pic:cNvPicPr>
                       <a:picLocks noChangeArrowheads="1" noChangeAspect="1"/>
                     </pic:cNvPicPr>
                   </pic:nvPicPr>
                   <pic:blipFill>
-                    <a:blip r:embed="rId118"/>
+                    <a:blip r:embed="rId126"/>
                     <a:stretch>
                       <a:fillRect/>
                     </a:stretch>
@@ -6403,172 +6586,12 @@
           <wp:inline>
             <wp:extent cx="5334000" cy="2424545"/>
             <wp:effectExtent b="0" l="0" r="0" t="0"/>
-            <wp:docPr descr="Figure 10.1: Note: Four causes are modelled jointly: ischaemic heart disease, ischaemic stroke, intracerebral haemorrhage, and hypertensive heart disease. Under the business-as-usual scenario, hypertension control and statin coverage remain at 2024 levels through 2050. Population denominators from UNWPP 2024; epidemiological inputs from GBD 2023." title="" id="122" name="Picture"/>
+            <wp:docPr descr="Figure 10.1: Note: Four causes are modelled jointly: ischaemic heart disease, ischaemic stroke, intracerebral haemorrhage, and hypertensive heart disease. Under the business-as-usual scenario, hypertension control and statin coverage remain at 2024 levels through 2050. Population denominators from UNWPP 2024; epidemiological inputs from GBD 2023." title="" id="130" name="Picture"/>
             <a:graphic>
               <a:graphicData uri="http://schemas.openxmlformats.org/drawingml/2006/picture">
                 <pic:pic>
                   <pic:nvPicPr>
-                    <pic:cNvPr descr="../output/aim1_disease_trend.png" id="123" name="Picture"/>
-                    <pic:cNvPicPr>
-                      <a:picLocks noChangeArrowheads="1" noChangeAspect="1"/>
-                    </pic:cNvPicPr>
-                  </pic:nvPicPr>
-                  <pic:blipFill>
-                    <a:blip r:embed="rId121"/>
-                    <a:stretch>
-                      <a:fillRect/>
-                    </a:stretch>
-                  </pic:blipFill>
-                  <pic:spPr bwMode="auto">
-                    <a:xfrm>
-                      <a:off x="0" y="0"/>
-                      <a:ext cx="5334000" cy="2424545"/>
-                    </a:xfrm>
-                    <a:prstGeom prst="rect">
-                      <a:avLst/>
-                    </a:prstGeom>
-                    <a:noFill/>
-                    <a:ln w="9525">
-                      <a:noFill/>
-                      <a:headEnd/>
-                      <a:tailEnd/>
-                    </a:ln>
-                  </pic:spPr>
-                </pic:pic>
-              </a:graphicData>
-            </a:graphic>
-          </wp:inline>
-        </w:drawing>
-      </w:r>
-    </w:p>
-    <w:p>
-      <w:pPr>
-        <w:pStyle w:val="ImageCaption"/>
-      </w:pPr>
-      <w:bookmarkStart w:id="124" w:name="fig:fig1-paper"/>
-      <w:bookmarkEnd w:id="124"/>
-      <w:r>
-        <w:t xml:space="preserve">Figure 10.1: Note: Four causes are modelled jointly: ischaemic heart disease, ischaemic stroke, intracerebral haemorrhage, and hypertensive heart disease. Under the business-as-usual scenario, hypertension control and statin coverage remain at 2024 levels through 2050. Population denominators from UNWPP 2024; epidemiological inputs from GBD 2023.</w:t>
-      </w:r>
-    </w:p>
-    <w:p>
-      <w:r>
-        <w:br w:type="page"/>
-      </w:r>
-    </w:p>
-    <w:p>
-      <w:pPr>
-        <w:pStyle w:val="BodyText"/>
-      </w:pPr>
-      <w:r>
-        <w:rPr>
-          <w:b/>
-          <w:bCs/>
-        </w:rPr>
-        <w:t xml:space="preserve">Supplemental Figure S2.</w:t>
-      </w:r>
-      <w:r>
-        <w:t xml:space="preserve"> </w:t>
-      </w:r>
-      <w:r>
-        <w:t xml:space="preserve">Cumulative CVD deaths averted by intervention scenario, 2025–2050.</w:t>
-      </w:r>
-    </w:p>
-    <w:p>
-      <w:pPr>
-        <w:pStyle w:val="CaptionedFigure"/>
-      </w:pPr>
-      <w:r>
-        <w:drawing>
-          <wp:inline>
-            <wp:extent cx="5334000" cy="2963333"/>
-            <wp:effectExtent b="0" l="0" r="0" t="0"/>
-            <wp:docPr descr="Figure 10.2: Note: Each bar represents the total number of CVD deaths averted relative to the business-as-usual scenario over 2026–2050 across all modelled countries. Interventions include hypertension control in the general population (50% control by 2030), hypertension control among people with diabetes (80% control by 2030), lipid-lowering therapy (50% statin coverage by 2030), and all three combined. All four CVD causes combined: ischaemic heart disease, ischaemic stroke, intracerebral haemorrhage, and hypertensive heart disease." title="" id="126" name="Picture"/>
-            <a:graphic>
-              <a:graphicData uri="http://schemas.openxmlformats.org/drawingml/2006/picture">
-                <pic:pic>
-                  <pic:nvPicPr>
-                    <pic:cNvPr descr="../output/aim1_fig1_deaths_intervention.png" id="127" name="Picture"/>
-                    <pic:cNvPicPr>
-                      <a:picLocks noChangeArrowheads="1" noChangeAspect="1"/>
-                    </pic:cNvPicPr>
-                  </pic:nvPicPr>
-                  <pic:blipFill>
-                    <a:blip r:embed="rId125"/>
-                    <a:stretch>
-                      <a:fillRect/>
-                    </a:stretch>
-                  </pic:blipFill>
-                  <pic:spPr bwMode="auto">
-                    <a:xfrm>
-                      <a:off x="0" y="0"/>
-                      <a:ext cx="5334000" cy="2963333"/>
-                    </a:xfrm>
-                    <a:prstGeom prst="rect">
-                      <a:avLst/>
-                    </a:prstGeom>
-                    <a:noFill/>
-                    <a:ln w="9525">
-                      <a:noFill/>
-                      <a:headEnd/>
-                      <a:tailEnd/>
-                    </a:ln>
-                  </pic:spPr>
-                </pic:pic>
-              </a:graphicData>
-            </a:graphic>
-          </wp:inline>
-        </w:drawing>
-      </w:r>
-    </w:p>
-    <w:p>
-      <w:pPr>
-        <w:pStyle w:val="ImageCaption"/>
-      </w:pPr>
-      <w:bookmarkStart w:id="128" w:name="fig:fig2-paper"/>
-      <w:bookmarkEnd w:id="128"/>
-      <w:r>
-        <w:t xml:space="preserve">Figure 10.2: Note: Each bar represents the total number of CVD deaths averted relative to the business-as-usual scenario over 2026–2050 across all modelled countries. Interventions include hypertension control in the general population (50% control by 2030), hypertension control among people with diabetes (80% control by 2030), lipid-lowering therapy (50% statin coverage by 2030), and all three combined. All four CVD causes combined: ischaemic heart disease, ischaemic stroke, intracerebral haemorrhage, and hypertensive heart disease.</w:t>
-      </w:r>
-    </w:p>
-    <w:p>
-      <w:r>
-        <w:br w:type="page"/>
-      </w:r>
-    </w:p>
-    <w:p>
-      <w:pPr>
-        <w:pStyle w:val="BodyText"/>
-      </w:pPr>
-      <w:r>
-        <w:rPr>
-          <w:b/>
-          <w:bCs/>
-        </w:rPr>
-        <w:t xml:space="preserve">Supplemental Figure S3.</w:t>
-      </w:r>
-      <w:r>
-        <w:t xml:space="preserve"> </w:t>
-      </w:r>
-      <w:r>
-        <w:t xml:space="preserve">Annual and cumulative CVD deaths averted by intervention over time, 2025–2050.</w:t>
-      </w:r>
-    </w:p>
-    <w:p>
-      <w:pPr>
-        <w:pStyle w:val="CaptionedFigure"/>
-      </w:pPr>
-      <w:r>
-        <w:drawing>
-          <wp:inline>
-            <wp:extent cx="5334000" cy="2424545"/>
-            <wp:effectExtent b="0" l="0" r="0" t="0"/>
-            <wp:docPr descr="Figure 10.3: Note: The stacked area chart shows annual deaths averted by each intervention relative to business-as-usual across all modelled countries. Interventions scale up linearly from 2026 to 2030 and are sustained through 2050. Gains accelerate after 2030 as sustained coverage compounds cumulative risk reduction." title="" id="130" name="Picture"/>
-            <a:graphic>
-              <a:graphicData uri="http://schemas.openxmlformats.org/drawingml/2006/picture">
-                <pic:pic>
-                  <pic:nvPicPr>
-                    <pic:cNvPr descr="../output/aim1_fig3_annual_averted.png" id="131" name="Picture"/>
+                    <pic:cNvPr descr="../output/aim1_disease_trend.png" id="131" name="Picture"/>
                     <pic:cNvPicPr>
                       <a:picLocks noChangeArrowheads="1" noChangeAspect="1"/>
                     </pic:cNvPicPr>
@@ -6605,10 +6628,10 @@
       <w:pPr>
         <w:pStyle w:val="ImageCaption"/>
       </w:pPr>
-      <w:bookmarkStart w:id="132" w:name="fig:fig3-paper"/>
+      <w:bookmarkStart w:id="132" w:name="fig:fig1-paper"/>
       <w:bookmarkEnd w:id="132"/>
       <w:r>
-        <w:t xml:space="preserve">Figure 10.3: Note: The stacked area chart shows annual deaths averted by each intervention relative to business-as-usual across all modelled countries. Interventions scale up linearly from 2026 to 2030 and are sustained through 2050. Gains accelerate after 2030 as sustained coverage compounds cumulative risk reduction.</w:t>
+        <w:t xml:space="preserve">Figure 10.1: Note: Four causes are modelled jointly: ischaemic heart disease, ischaemic stroke, intracerebral haemorrhage, and hypertensive heart disease. Under the business-as-usual scenario, hypertension control and statin coverage remain at 2024 levels through 2050. Population denominators from UNWPP 2024; epidemiological inputs from GBD 2023.</w:t>
       </w:r>
     </w:p>
     <w:p>
@@ -6625,13 +6648,13 @@
           <w:b/>
           <w:bCs/>
         </w:rPr>
-        <w:t xml:space="preserve">Supplemental Figure S4.</w:t>
-      </w:r>
-      <w:r>
-        <w:t xml:space="preserve"> </w:t>
-      </w:r>
-      <w:r>
-        <w:t xml:space="preserve">Age-standardised CVD mortality rate (ASMR) by intervention scenario, 2019–2050.</w:t>
+        <w:t xml:space="preserve">Supplemental Figure S2.</w:t>
+      </w:r>
+      <w:r>
+        <w:t xml:space="preserve"> </w:t>
+      </w:r>
+      <w:r>
+        <w:t xml:space="preserve">Cumulative CVD deaths averted by intervention scenario, 2026-2050.</w:t>
       </w:r>
     </w:p>
     <w:p>
@@ -6641,100 +6664,20 @@
       <w:r>
         <w:drawing>
           <wp:inline>
-            <wp:extent cx="5334000" cy="2667000"/>
+            <wp:extent cx="5334000" cy="2963333"/>
             <wp:effectExtent b="0" l="0" r="0" t="0"/>
-            <wp:docPr descr="Figure 10.4: Note: Age-standardised CVD mortality rate across all modelled countries by intervention scenario. Solid lines represent the calibration period (2019–2025); dashed lines represent the projection period (2026–2050). ASMR computed using the WHO World Standard Population, rescaled to ages 20–95+. Interventions scale up linearly from 2026 to 2030." title="" id="134" name="Picture"/>
+            <wp:docPr descr="Figure 10.2: Note: Each bar represents the total number of CVD deaths averted relative to the business-as-usual scenario over 2026–2050 across all modelled countries. Interventions include hypertension control in the general population (50% control by 2030), hypertension control among people with diabetes (80% control by 2030), lipid-lowering therapy (50% statin coverage by 2030), and all three combined. All four CVD causes combined: ischaemic heart disease, ischaemic stroke, intracerebral haemorrhage, and hypertensive heart disease." title="" id="134" name="Picture"/>
             <a:graphic>
               <a:graphicData uri="http://schemas.openxmlformats.org/drawingml/2006/picture">
                 <pic:pic>
                   <pic:nvPicPr>
-                    <pic:cNvPr descr="../output/aim1_asmr_interventions.png" id="135" name="Picture"/>
+                    <pic:cNvPr descr="../output/aim1_fig1_deaths_intervention.png" id="135" name="Picture"/>
                     <pic:cNvPicPr>
                       <a:picLocks noChangeArrowheads="1" noChangeAspect="1"/>
                     </pic:cNvPicPr>
                   </pic:nvPicPr>
                   <pic:blipFill>
                     <a:blip r:embed="rId133"/>
-                    <a:stretch>
-                      <a:fillRect/>
-                    </a:stretch>
-                  </pic:blipFill>
-                  <pic:spPr bwMode="auto">
-                    <a:xfrm>
-                      <a:off x="0" y="0"/>
-                      <a:ext cx="5334000" cy="2667000"/>
-                    </a:xfrm>
-                    <a:prstGeom prst="rect">
-                      <a:avLst/>
-                    </a:prstGeom>
-                    <a:noFill/>
-                    <a:ln w="9525">
-                      <a:noFill/>
-                      <a:headEnd/>
-                      <a:tailEnd/>
-                    </a:ln>
-                  </pic:spPr>
-                </pic:pic>
-              </a:graphicData>
-            </a:graphic>
-          </wp:inline>
-        </w:drawing>
-      </w:r>
-    </w:p>
-    <w:p>
-      <w:pPr>
-        <w:pStyle w:val="ImageCaption"/>
-      </w:pPr>
-      <w:bookmarkStart w:id="136" w:name="fig:fig7-paper"/>
-      <w:bookmarkEnd w:id="136"/>
-      <w:r>
-        <w:t xml:space="preserve">Figure 10.4: Note: Age-standardised CVD mortality rate across all modelled countries by intervention scenario. Solid lines represent the calibration period (2019–2025); dashed lines represent the projection period (2026–2050). ASMR computed using the WHO World Standard Population, rescaled to ages 20–95+. Interventions scale up linearly from 2026 to 2030.</w:t>
-      </w:r>
-    </w:p>
-    <w:p>
-      <w:r>
-        <w:br w:type="page"/>
-      </w:r>
-    </w:p>
-    <w:p>
-      <w:pPr>
-        <w:pStyle w:val="BodyText"/>
-      </w:pPr>
-      <w:r>
-        <w:rPr>
-          <w:b/>
-          <w:bCs/>
-        </w:rPr>
-        <w:t xml:space="preserve">Supplemental Figure S5.</w:t>
-      </w:r>
-      <w:r>
-        <w:t xml:space="preserve"> </w:t>
-      </w:r>
-      <w:r>
-        <w:t xml:space="preserve">Deaths averted by cause of death and intervention scenario, 2025–2050.</w:t>
-      </w:r>
-    </w:p>
-    <w:p>
-      <w:pPr>
-        <w:pStyle w:val="CaptionedFigure"/>
-      </w:pPr>
-      <w:r>
-        <w:drawing>
-          <wp:inline>
-            <wp:extent cx="5334000" cy="2963333"/>
-            <wp:effectExtent b="0" l="0" r="0" t="0"/>
-            <wp:docPr descr="Figure 10.5: Note: Cumulative CVD deaths averted relative to business-as-usual across all modelled countries, stratified by cause of death and intervention scenario. Ischaemic heart disease accounts for the largest share of averted deaths across all interventions. Statin effects are restricted to ischaemic heart disease and ischaemic stroke; hypertension control affects all four causes." title="" id="138" name="Picture"/>
-            <a:graphic>
-              <a:graphicData uri="http://schemas.openxmlformats.org/drawingml/2006/picture">
-                <pic:pic>
-                  <pic:nvPicPr>
-                    <pic:cNvPr descr="../output/aim1_fig2_deaths_cause.png" id="139" name="Picture"/>
-                    <pic:cNvPicPr>
-                      <a:picLocks noChangeArrowheads="1" noChangeAspect="1"/>
-                    </pic:cNvPicPr>
-                  </pic:nvPicPr>
-                  <pic:blipFill>
-                    <a:blip r:embed="rId137"/>
                     <a:stretch>
                       <a:fillRect/>
                     </a:stretch>
@@ -6765,10 +6708,10 @@
       <w:pPr>
         <w:pStyle w:val="ImageCaption"/>
       </w:pPr>
-      <w:bookmarkStart w:id="140" w:name="fig:fig8-paper"/>
-      <w:bookmarkEnd w:id="140"/>
-      <w:r>
-        <w:t xml:space="preserve">Figure 10.5: Note: Cumulative CVD deaths averted relative to business-as-usual across all modelled countries, stratified by cause of death and intervention scenario. Ischaemic heart disease accounts for the largest share of averted deaths across all interventions. Statin effects are restricted to ischaemic heart disease and ischaemic stroke; hypertension control affects all four causes.</w:t>
+      <w:bookmarkStart w:id="136" w:name="fig:fig2-paper"/>
+      <w:bookmarkEnd w:id="136"/>
+      <w:r>
+        <w:t xml:space="preserve">Figure 10.2: Note: Each bar represents the total number of CVD deaths averted relative to the business-as-usual scenario over 2026–2050 across all modelled countries. Interventions include hypertension control in the general population (50% control by 2030), hypertension control among people with diabetes (80% control by 2030), lipid-lowering therapy (50% statin coverage by 2030), and all three combined. All four CVD causes combined: ischaemic heart disease, ischaemic stroke, intracerebral haemorrhage, and hypertensive heart disease.</w:t>
       </w:r>
     </w:p>
     <w:p>
@@ -6785,13 +6728,93 @@
           <w:b/>
           <w:bCs/>
         </w:rPr>
-        <w:t xml:space="preserve">Supplemental Figure S6.</w:t>
-      </w:r>
-      <w:r>
-        <w:t xml:space="preserve"> </w:t>
-      </w:r>
-      <w:r>
-        <w:t xml:space="preserve">Cumulative DALYs averted by intervention scenario over time, 2025–2050.</w:t>
+        <w:t xml:space="preserve">Supplemental Figure S3.</w:t>
+      </w:r>
+      <w:r>
+        <w:t xml:space="preserve"> </w:t>
+      </w:r>
+      <w:r>
+        <w:t xml:space="preserve">Annual and cumulative CVD deaths averted by intervention over time, 2026-2050.</w:t>
+      </w:r>
+    </w:p>
+    <w:p>
+      <w:pPr>
+        <w:pStyle w:val="CaptionedFigure"/>
+      </w:pPr>
+      <w:r>
+        <w:drawing>
+          <wp:inline>
+            <wp:extent cx="5334000" cy="2424545"/>
+            <wp:effectExtent b="0" l="0" r="0" t="0"/>
+            <wp:docPr descr="Figure 10.3: Note: The stacked area chart shows annual deaths averted by each intervention relative to business-as-usual across all modelled countries. Interventions scale up linearly from 2026 to 2030 and are sustained through 2050. Gains accelerate after 2030 as sustained coverage compounds cumulative risk reduction." title="" id="138" name="Picture"/>
+            <a:graphic>
+              <a:graphicData uri="http://schemas.openxmlformats.org/drawingml/2006/picture">
+                <pic:pic>
+                  <pic:nvPicPr>
+                    <pic:cNvPr descr="../output/aim1_fig3_annual_averted.png" id="139" name="Picture"/>
+                    <pic:cNvPicPr>
+                      <a:picLocks noChangeArrowheads="1" noChangeAspect="1"/>
+                    </pic:cNvPicPr>
+                  </pic:nvPicPr>
+                  <pic:blipFill>
+                    <a:blip r:embed="rId137"/>
+                    <a:stretch>
+                      <a:fillRect/>
+                    </a:stretch>
+                  </pic:blipFill>
+                  <pic:spPr bwMode="auto">
+                    <a:xfrm>
+                      <a:off x="0" y="0"/>
+                      <a:ext cx="5334000" cy="2424545"/>
+                    </a:xfrm>
+                    <a:prstGeom prst="rect">
+                      <a:avLst/>
+                    </a:prstGeom>
+                    <a:noFill/>
+                    <a:ln w="9525">
+                      <a:noFill/>
+                      <a:headEnd/>
+                      <a:tailEnd/>
+                    </a:ln>
+                  </pic:spPr>
+                </pic:pic>
+              </a:graphicData>
+            </a:graphic>
+          </wp:inline>
+        </w:drawing>
+      </w:r>
+    </w:p>
+    <w:p>
+      <w:pPr>
+        <w:pStyle w:val="ImageCaption"/>
+      </w:pPr>
+      <w:bookmarkStart w:id="140" w:name="fig:fig3-paper"/>
+      <w:bookmarkEnd w:id="140"/>
+      <w:r>
+        <w:t xml:space="preserve">Figure 10.3: Note: The stacked area chart shows annual deaths averted by each intervention relative to business-as-usual across all modelled countries. Interventions scale up linearly from 2026 to 2030 and are sustained through 2050. Gains accelerate after 2030 as sustained coverage compounds cumulative risk reduction.</w:t>
+      </w:r>
+    </w:p>
+    <w:p>
+      <w:r>
+        <w:br w:type="page"/>
+      </w:r>
+    </w:p>
+    <w:p>
+      <w:pPr>
+        <w:pStyle w:val="BodyText"/>
+      </w:pPr>
+      <w:r>
+        <w:rPr>
+          <w:b/>
+          <w:bCs/>
+        </w:rPr>
+        <w:t xml:space="preserve">Supplemental Figure S4.</w:t>
+      </w:r>
+      <w:r>
+        <w:t xml:space="preserve"> </w:t>
+      </w:r>
+      <w:r>
+        <w:t xml:space="preserve">Age-standardised CVD mortality rate (ASMR) by intervention scenario, 2019–2050.</w:t>
       </w:r>
     </w:p>
     <w:p>
@@ -6803,12 +6826,12 @@
           <wp:inline>
             <wp:extent cx="5334000" cy="2667000"/>
             <wp:effectExtent b="0" l="0" r="0" t="0"/>
-            <wp:docPr descr="Figure 10.6: Note: Cumulative disability-adjusted life years (DALYs) averted relative to business-as-usual across all modelled countries, by intervention scenario over 2026–2050. DALYs combine years of life lost (YLLs) and years lived with disability (YLDs) for ischaemic heart disease, ischaemic stroke, intracerebral haemorrhage, and hypertensive heart disease." title="" id="142" name="Picture"/>
+            <wp:docPr descr="Figure 10.4: Note: Age-standardised CVD mortality rate across all modelled countries by intervention scenario. Solid lines represent the calibration period (2019–2025); dashed lines represent the projection period (2026–2050). ASMR computed using the WHO World Standard Population, rescaled to ages 20–95+. Interventions scale up linearly from 2026 to 2030." title="" id="142" name="Picture"/>
             <a:graphic>
               <a:graphicData uri="http://schemas.openxmlformats.org/drawingml/2006/picture">
                 <pic:pic>
                   <pic:nvPicPr>
-                    <pic:cNvPr descr="../output/aim1_bod_fig1_dalys_ts.png" id="143" name="Picture"/>
+                    <pic:cNvPr descr="../output/aim1_asmr_interventions.png" id="143" name="Picture"/>
                     <pic:cNvPicPr>
                       <a:picLocks noChangeArrowheads="1" noChangeAspect="1"/>
                     </pic:cNvPicPr>
@@ -6845,10 +6868,10 @@
       <w:pPr>
         <w:pStyle w:val="ImageCaption"/>
       </w:pPr>
-      <w:bookmarkStart w:id="144" w:name="fig:fig9-paper"/>
+      <w:bookmarkStart w:id="144" w:name="fig:fig7-paper"/>
       <w:bookmarkEnd w:id="144"/>
       <w:r>
-        <w:t xml:space="preserve">Figure 10.6: Note: Cumulative disability-adjusted life years (DALYs) averted relative to business-as-usual across all modelled countries, by intervention scenario over 2026–2050. DALYs combine years of life lost (YLLs) and years lived with disability (YLDs) for ischaemic heart disease, ischaemic stroke, intracerebral haemorrhage, and hypertensive heart disease.</w:t>
+        <w:t xml:space="preserve">Figure 10.4: Note: Age-standardised CVD mortality rate across all modelled countries by intervention scenario. Solid lines represent the calibration period (2019–2025); dashed lines represent the projection period (2026–2050). ASMR computed using the WHO World Standard Population, rescaled to ages 20–95+. Interventions scale up linearly from 2026 to 2030.</w:t>
       </w:r>
     </w:p>
     <w:p>
@@ -6865,13 +6888,13 @@
           <w:b/>
           <w:bCs/>
         </w:rPr>
-        <w:t xml:space="preserve">Supplemental Figure S7.</w:t>
-      </w:r>
-      <w:r>
-        <w:t xml:space="preserve"> </w:t>
-      </w:r>
-      <w:r>
-        <w:t xml:space="preserve">Deaths averted per 100,000 population under the combined intervention scenario, 2025–2050.</w:t>
+        <w:t xml:space="preserve">Supplemental Figure S5.</w:t>
+      </w:r>
+      <w:r>
+        <w:t xml:space="preserve"> </w:t>
+      </w:r>
+      <w:r>
+        <w:t xml:space="preserve">Deaths averted by cause of death and intervention scenario, 2026-2050.</w:t>
       </w:r>
     </w:p>
     <w:p>
@@ -6881,20 +6904,180 @@
       <w:r>
         <w:drawing>
           <wp:inline>
-            <wp:extent cx="5334000" cy="2424545"/>
+            <wp:extent cx="5334000" cy="2963333"/>
             <wp:effectExtent b="0" l="0" r="0" t="0"/>
-            <wp:docPr descr="Figure 10.7: Note: Choropleth map showing cumulative CVD deaths averted per 100,000 population across all modelled countries under the combined intervention scenario (all three WHO targets achieved by 2030, sustained through 2050). Darker shading indicates larger per-capita health gains. Geographic variation reflects differences in baseline CVD burden, population age structure, and current treatment coverage." title="" id="146" name="Picture"/>
+            <wp:docPr descr="Figure 10.5: Note: Cumulative CVD deaths averted relative to business-as-usual across all modelled countries, stratified by cause of death and intervention scenario. Ischaemic heart disease accounts for the largest share of averted deaths across all interventions. Statin effects are restricted to ischaemic heart disease and ischaemic stroke; hypertension control affects all four causes." title="" id="146" name="Picture"/>
             <a:graphic>
               <a:graphicData uri="http://schemas.openxmlformats.org/drawingml/2006/picture">
                 <pic:pic>
                   <pic:nvPicPr>
-                    <pic:cNvPr descr="../output/aim1_fig6_map.png" id="147" name="Picture"/>
+                    <pic:cNvPr descr="../output/aim1_fig2_deaths_cause.png" id="147" name="Picture"/>
                     <pic:cNvPicPr>
                       <a:picLocks noChangeArrowheads="1" noChangeAspect="1"/>
                     </pic:cNvPicPr>
                   </pic:nvPicPr>
                   <pic:blipFill>
                     <a:blip r:embed="rId145"/>
+                    <a:stretch>
+                      <a:fillRect/>
+                    </a:stretch>
+                  </pic:blipFill>
+                  <pic:spPr bwMode="auto">
+                    <a:xfrm>
+                      <a:off x="0" y="0"/>
+                      <a:ext cx="5334000" cy="2963333"/>
+                    </a:xfrm>
+                    <a:prstGeom prst="rect">
+                      <a:avLst/>
+                    </a:prstGeom>
+                    <a:noFill/>
+                    <a:ln w="9525">
+                      <a:noFill/>
+                      <a:headEnd/>
+                      <a:tailEnd/>
+                    </a:ln>
+                  </pic:spPr>
+                </pic:pic>
+              </a:graphicData>
+            </a:graphic>
+          </wp:inline>
+        </w:drawing>
+      </w:r>
+    </w:p>
+    <w:p>
+      <w:pPr>
+        <w:pStyle w:val="ImageCaption"/>
+      </w:pPr>
+      <w:bookmarkStart w:id="148" w:name="fig:fig8-paper"/>
+      <w:bookmarkEnd w:id="148"/>
+      <w:r>
+        <w:t xml:space="preserve">Figure 10.5: Note: Cumulative CVD deaths averted relative to business-as-usual across all modelled countries, stratified by cause of death and intervention scenario. Ischaemic heart disease accounts for the largest share of averted deaths across all interventions. Statin effects are restricted to ischaemic heart disease and ischaemic stroke; hypertension control affects all four causes.</w:t>
+      </w:r>
+    </w:p>
+    <w:p>
+      <w:r>
+        <w:br w:type="page"/>
+      </w:r>
+    </w:p>
+    <w:p>
+      <w:pPr>
+        <w:pStyle w:val="BodyText"/>
+      </w:pPr>
+      <w:r>
+        <w:rPr>
+          <w:b/>
+          <w:bCs/>
+        </w:rPr>
+        <w:t xml:space="preserve">Supplemental Figure S6.</w:t>
+      </w:r>
+      <w:r>
+        <w:t xml:space="preserve"> </w:t>
+      </w:r>
+      <w:r>
+        <w:t xml:space="preserve">Cumulative DALYs averted by intervention scenario over time, 2026-2050.</w:t>
+      </w:r>
+    </w:p>
+    <w:p>
+      <w:pPr>
+        <w:pStyle w:val="CaptionedFigure"/>
+      </w:pPr>
+      <w:r>
+        <w:drawing>
+          <wp:inline>
+            <wp:extent cx="5334000" cy="2667000"/>
+            <wp:effectExtent b="0" l="0" r="0" t="0"/>
+            <wp:docPr descr="Figure 10.6: Note: Cumulative disability-adjusted life years (DALYs) averted relative to business-as-usual across all modelled countries, by intervention scenario over 2026–2050. DALYs combine years of life lost (YLLs) and years lived with disability (YLDs) for ischaemic heart disease, ischaemic stroke, intracerebral haemorrhage, and hypertensive heart disease." title="" id="150" name="Picture"/>
+            <a:graphic>
+              <a:graphicData uri="http://schemas.openxmlformats.org/drawingml/2006/picture">
+                <pic:pic>
+                  <pic:nvPicPr>
+                    <pic:cNvPr descr="../output/aim1_bod_fig1_dalys_ts.png" id="151" name="Picture"/>
+                    <pic:cNvPicPr>
+                      <a:picLocks noChangeArrowheads="1" noChangeAspect="1"/>
+                    </pic:cNvPicPr>
+                  </pic:nvPicPr>
+                  <pic:blipFill>
+                    <a:blip r:embed="rId149"/>
+                    <a:stretch>
+                      <a:fillRect/>
+                    </a:stretch>
+                  </pic:blipFill>
+                  <pic:spPr bwMode="auto">
+                    <a:xfrm>
+                      <a:off x="0" y="0"/>
+                      <a:ext cx="5334000" cy="2667000"/>
+                    </a:xfrm>
+                    <a:prstGeom prst="rect">
+                      <a:avLst/>
+                    </a:prstGeom>
+                    <a:noFill/>
+                    <a:ln w="9525">
+                      <a:noFill/>
+                      <a:headEnd/>
+                      <a:tailEnd/>
+                    </a:ln>
+                  </pic:spPr>
+                </pic:pic>
+              </a:graphicData>
+            </a:graphic>
+          </wp:inline>
+        </w:drawing>
+      </w:r>
+    </w:p>
+    <w:p>
+      <w:pPr>
+        <w:pStyle w:val="ImageCaption"/>
+      </w:pPr>
+      <w:bookmarkStart w:id="152" w:name="fig:fig9-paper"/>
+      <w:bookmarkEnd w:id="152"/>
+      <w:r>
+        <w:t xml:space="preserve">Figure 10.6: Note: Cumulative disability-adjusted life years (DALYs) averted relative to business-as-usual across all modelled countries, by intervention scenario over 2026–2050. DALYs combine years of life lost (YLLs) and years lived with disability (YLDs) for ischaemic heart disease, ischaemic stroke, intracerebral haemorrhage, and hypertensive heart disease.</w:t>
+      </w:r>
+    </w:p>
+    <w:p>
+      <w:r>
+        <w:br w:type="page"/>
+      </w:r>
+    </w:p>
+    <w:p>
+      <w:pPr>
+        <w:pStyle w:val="BodyText"/>
+      </w:pPr>
+      <w:r>
+        <w:rPr>
+          <w:b/>
+          <w:bCs/>
+        </w:rPr>
+        <w:t xml:space="preserve">Supplemental Figure S7.</w:t>
+      </w:r>
+      <w:r>
+        <w:t xml:space="preserve"> </w:t>
+      </w:r>
+      <w:r>
+        <w:t xml:space="preserve">Deaths averted per 100,000 population under the combined intervention scenario, 2026-2050.</w:t>
+      </w:r>
+    </w:p>
+    <w:p>
+      <w:pPr>
+        <w:pStyle w:val="CaptionedFigure"/>
+      </w:pPr>
+      <w:r>
+        <w:drawing>
+          <wp:inline>
+            <wp:extent cx="5334000" cy="2424545"/>
+            <wp:effectExtent b="0" l="0" r="0" t="0"/>
+            <wp:docPr descr="Figure 10.7: Note: Choropleth map showing cumulative CVD deaths averted per 100,000 population across all modelled countries under the combined intervention scenario (all three WHO targets achieved by 2030, sustained through 2050). Darker shading indicates larger per-capita health gains. Geographic variation reflects differences in baseline CVD burden, population age structure, and current treatment coverage." title="" id="154" name="Picture"/>
+            <a:graphic>
+              <a:graphicData uri="http://schemas.openxmlformats.org/drawingml/2006/picture">
+                <pic:pic>
+                  <pic:nvPicPr>
+                    <pic:cNvPr descr="../output/aim1_fig6_map.png" id="155" name="Picture"/>
+                    <pic:cNvPicPr>
+                      <a:picLocks noChangeArrowheads="1" noChangeAspect="1"/>
+                    </pic:cNvPicPr>
+                  </pic:nvPicPr>
+                  <pic:blipFill>
+                    <a:blip r:embed="rId153"/>
                     <a:stretch>
                       <a:fillRect/>
                     </a:stretch>
@@ -6925,8 +7108,8 @@
       <w:pPr>
         <w:pStyle w:val="ImageCaption"/>
       </w:pPr>
-      <w:bookmarkStart w:id="148" w:name="fig:fig10-paper"/>
-      <w:bookmarkEnd w:id="148"/>
+      <w:bookmarkStart w:id="156" w:name="fig:fig10-paper"/>
+      <w:bookmarkEnd w:id="156"/>
       <w:r>
         <w:t xml:space="preserve">Figure 10.7: Note: Choropleth map showing cumulative CVD deaths averted per 100,000 population across all modelled countries under the combined intervention scenario (all three WHO targets achieved by 2030, sustained through 2050). Darker shading indicates larger per-capita health gains. Geographic variation reflects differences in baseline CVD burden, population age structure, and current treatment coverage.</w:t>
       </w:r>
@@ -6951,7 +7134,7 @@
         <w:t xml:space="preserve"> </w:t>
       </w:r>
       <w:r>
-        <w:t xml:space="preserve">Economic value of avoidable CVD mortality as a proportion of regional income, by WHO region and period, 2025–2050.</w:t>
+        <w:t xml:space="preserve">Economic value of avoidable CVD mortality as a proportion of regional income, by WHO region and period, 2026-2050.</w:t>
       </w:r>
     </w:p>
     <w:p>
@@ -6963,18 +7146,18 @@
           <wp:inline>
             <wp:extent cx="5334000" cy="3006436"/>
             <wp:effectExtent b="0" l="0" r="0" t="0"/>
-            <wp:docPr descr="Figure 10.8: Note: VSLY values as a proportion of discounted GNI, by WHO region and snapshot year (2026, 2030, 2040, 2050) and cumulative 2026–2050. Primary elasticity (differential 0.8 HIC / 1.2 LMIC per Robinson et al. 2019). Discounted at 3%. All Interventions scenario." title="" id="150" name="Picture"/>
+            <wp:docPr descr="Figure 10.8: Note: VSLY values as a proportion of discounted GNI, by WHO region and snapshot year (2026, 2030, 2040, 2050) and cumulative 2026–2050. Primary elasticity (differential 0.8 HIC / 1.2 LMIC per Robinson et al. 2019). Discounted at 3%. All Interventions scenario." title="" id="158" name="Picture"/>
             <a:graphic>
               <a:graphicData uri="http://schemas.openxmlformats.org/drawingml/2006/picture">
                 <pic:pic>
                   <pic:nvPicPr>
-                    <pic:cNvPr descr="../output/slides/sl_econ_dotplot.png" id="151" name="Picture"/>
+                    <pic:cNvPr descr="../output/slides/sl_econ_dotplot.png" id="159" name="Picture"/>
                     <pic:cNvPicPr>
                       <a:picLocks noChangeArrowheads="1" noChangeAspect="1"/>
                     </pic:cNvPicPr>
                   </pic:nvPicPr>
                   <pic:blipFill>
-                    <a:blip r:embed="rId149"/>
+                    <a:blip r:embed="rId157"/>
                     <a:stretch>
                       <a:fillRect/>
                     </a:stretch>
@@ -7005,8 +7188,8 @@
       <w:pPr>
         <w:pStyle w:val="ImageCaption"/>
       </w:pPr>
-      <w:bookmarkStart w:id="152" w:name="fig:fig-econ-dotplot"/>
-      <w:bookmarkEnd w:id="152"/>
+      <w:bookmarkStart w:id="160" w:name="fig:fig-econ-dotplot"/>
+      <w:bookmarkEnd w:id="160"/>
       <w:r>
         <w:t xml:space="preserve">Figure 10.8: Note: VSLY values as a proportion of discounted GNI, by WHO region and snapshot year (2026, 2030, 2040, 2050) and cumulative 2026–2050. Primary elasticity (differential 0.8 HIC / 1.2 LMIC per Robinson et al. 2019). Discounted at 3%. All Interventions scenario.</w:t>
       </w:r>
@@ -7016,8 +7199,8 @@
         <w:br w:type="page"/>
       </w:r>
     </w:p>
-    <w:bookmarkEnd w:id="153"/>
-    <w:bookmarkStart w:id="172" w:name="sec:math-details"/>
+    <w:bookmarkEnd w:id="161"/>
+    <w:bookmarkStart w:id="180" w:name="sec:math-details"/>
     <w:p>
       <w:pPr>
         <w:pStyle w:val="Heading2"/>
@@ -7035,7 +7218,7 @@
         <w:t xml:space="preserve">Methodology and Mathematical Details</w:t>
       </w:r>
     </w:p>
-    <w:bookmarkStart w:id="154" w:name="sec:math-notation"/>
+    <w:bookmarkStart w:id="162" w:name="sec:math-notation"/>
     <w:p>
       <w:pPr>
         <w:pStyle w:val="Heading3"/>
@@ -8570,8 +8753,8 @@
         <w:br w:type="page"/>
       </w:r>
     </w:p>
-    <w:bookmarkEnd w:id="154"/>
-    <w:bookmarkStart w:id="155" w:name="sec:param-appendix"/>
+    <w:bookmarkEnd w:id="162"/>
+    <w:bookmarkStart w:id="163" w:name="sec:param-appendix"/>
     <w:p>
       <w:pPr>
         <w:pStyle w:val="Heading3"/>
@@ -11526,8 +11709,8 @@
         <w:t xml:space="preserve">; UNWPP 2024: United Nations World Population Prospects 2024 revision.</w:t>
       </w:r>
     </w:p>
-    <w:bookmarkEnd w:id="155"/>
-    <w:bookmarkStart w:id="156" w:name="sec:transition-model"/>
+    <w:bookmarkEnd w:id="163"/>
+    <w:bookmarkStart w:id="164" w:name="sec:transition-model"/>
     <w:p>
       <w:pPr>
         <w:pStyle w:val="Heading3"/>
@@ -15550,8 +15733,8 @@
         <w:t xml:space="preserve">(Parameter values for all transition rates are listed in the Key Parameter Appendix.)</w:t>
       </w:r>
     </w:p>
-    <w:bookmarkEnd w:id="156"/>
-    <w:bookmarkStart w:id="158" w:name="sec:htn-model"/>
+    <w:bookmarkEnd w:id="164"/>
+    <w:bookmarkStart w:id="166" w:name="sec:htn-model"/>
     <w:p>
       <w:pPr>
         <w:pStyle w:val="Heading3"/>
@@ -19474,7 +19657,7 @@
         <w:t xml:space="preserve">(See Multi-State Transition Model for the baseline transition structure into which these effect ratios enter; see Key Parameter Appendix for all intervention effect sizes and their sources.)</w:t>
       </w:r>
     </w:p>
-    <w:bookmarkStart w:id="157" w:name="sec:htn-diabetes"/>
+    <w:bookmarkStart w:id="165" w:name="sec:htn-diabetes"/>
     <w:p>
       <w:pPr>
         <w:pStyle w:val="Heading4"/>
@@ -20284,9 +20467,9 @@
         <w:t xml:space="preserve">(See Hypertension Control Intervention Model above for the general-population coverage scale-up structure, which shares the same functional form.)</w:t>
       </w:r>
     </w:p>
-    <w:bookmarkEnd w:id="157"/>
-    <w:bookmarkEnd w:id="158"/>
-    <w:bookmarkStart w:id="159" w:name="sec:statin-model"/>
+    <w:bookmarkEnd w:id="165"/>
+    <w:bookmarkEnd w:id="166"/>
+    <w:bookmarkStart w:id="167" w:name="sec:statin-model"/>
     <w:p>
       <w:pPr>
         <w:pStyle w:val="Heading3"/>
@@ -23924,8 +24107,8 @@
         <w:t xml:space="preserve">(See Key Parameter Appendix for all statin effect sizes and their sources.)</w:t>
       </w:r>
     </w:p>
-    <w:bookmarkEnd w:id="159"/>
-    <w:bookmarkStart w:id="164" w:name="sec:daly-methods"/>
+    <w:bookmarkEnd w:id="167"/>
+    <w:bookmarkStart w:id="172" w:name="sec:daly-methods"/>
     <w:p>
       <w:pPr>
         <w:pStyle w:val="Heading3"/>
@@ -24020,7 +24203,7 @@
         <w:t xml:space="preserve">.</w:t>
       </w:r>
     </w:p>
-    <w:bookmarkStart w:id="160" w:name="years-of-life-lost-yll"/>
+    <w:bookmarkStart w:id="168" w:name="years-of-life-lost-yll"/>
     <w:p>
       <w:pPr>
         <w:pStyle w:val="Heading4"/>
@@ -24449,8 +24632,8 @@
         <w:t xml:space="preserve">, taken from the United Nations World Population Prospects 2024 revision, medium variant (both sexes combined). Life expectancy values are country- and year-specific, reflecting projected demographic conditions rather than a fixed global standard.</w:t>
       </w:r>
     </w:p>
-    <w:bookmarkEnd w:id="160"/>
-    <w:bookmarkStart w:id="161" w:name="years-lived-with-disability-yld"/>
+    <w:bookmarkEnd w:id="168"/>
+    <w:bookmarkStart w:id="169" w:name="years-lived-with-disability-yld"/>
     <w:p>
       <w:pPr>
         <w:pStyle w:val="Heading4"/>
@@ -24973,8 +25156,8 @@
         <w:t xml:space="preserve">This approach yields an implicit, frequency-weighted average disability weight that reflects the severity distribution observed in each country. No explicit duration of disability was modelled; the prevalence-based formulation captures the YLD burden attributable to the stock of prevalent cases at each time point.</w:t>
       </w:r>
     </w:p>
-    <w:bookmarkEnd w:id="161"/>
-    <w:bookmarkStart w:id="162" w:name="disability-adjusted-life-years-daly"/>
+    <w:bookmarkEnd w:id="169"/>
+    <w:bookmarkStart w:id="170" w:name="disability-adjusted-life-years-daly"/>
     <w:p>
       <w:pPr>
         <w:pStyle w:val="Heading4"/>
@@ -25533,8 +25716,8 @@
         <w:t xml:space="preserve">The same differencing logic was applied separately to YLLs averted and YLDs averted.</w:t>
       </w:r>
     </w:p>
-    <w:bookmarkEnd w:id="162"/>
-    <w:bookmarkStart w:id="163" w:name="reference-standards-and-weights"/>
+    <w:bookmarkEnd w:id="170"/>
+    <w:bookmarkStart w:id="171" w:name="reference-standards-and-weights"/>
     <w:p>
       <w:pPr>
         <w:pStyle w:val="Heading4"/>
@@ -25931,29 +26114,9 @@
         <w:t xml:space="preserve">Sources: United Nations, Department of Economic and Social Affairs, Population Division (2024). World Population Prospects 2024, Online Edition. Institute for Health Metrics and Evaluation (IHME). Global Burden of Disease Study 2023 (GBD 2023) Results. Seattle, United States: IHME, 2024.</w:t>
       </w:r>
     </w:p>
-    <w:p>
-      <w:pPr>
-        <w:pStyle w:val="BodyText"/>
-      </w:pPr>
-      <w:r>
-        <w:t xml:space="preserve">All DALY, YLL, and YLD results reported in the main manuscript are computed using the above specifications, as implemented in</w:t>
-      </w:r>
-      <w:r>
-        <w:t xml:space="preserve"> </w:t>
-      </w:r>
-      <w:r>
-        <w:rPr>
-          <w:rStyle w:val="VerbatimChar"/>
-        </w:rPr>
-        <w:t xml:space="preserve">07_output_dalys.R</w:t>
-      </w:r>
-      <w:r>
-        <w:t xml:space="preserve">.</w:t>
-      </w:r>
-    </w:p>
-    <w:bookmarkEnd w:id="163"/>
-    <w:bookmarkEnd w:id="164"/>
-    <w:bookmarkStart w:id="171" w:name="sec:econ-methods"/>
+    <w:bookmarkEnd w:id="171"/>
+    <w:bookmarkEnd w:id="172"/>
+    <w:bookmarkStart w:id="179" w:name="sec:econ-methods"/>
     <w:p>
       <w:pPr>
         <w:pStyle w:val="Heading3"/>
@@ -25988,7 +26151,7 @@
         <w:t xml:space="preserve">.</w:t>
       </w:r>
     </w:p>
-    <w:bookmarkStart w:id="165" w:name="value-of-a-statistical-life-vsl-transfer"/>
+    <w:bookmarkStart w:id="173" w:name="value-of-a-statistical-life-vsl-transfer"/>
     <w:p>
       <w:pPr>
         <w:pStyle w:val="Heading4"/>
@@ -26752,8 +26915,8 @@
         <w:t xml:space="preserve">is the minimum VSL-to-GNI ratio.</w:t>
       </w:r>
     </w:p>
-    <w:bookmarkEnd w:id="165"/>
-    <w:bookmarkStart w:id="166" w:name="gni-per-capita-projection"/>
+    <w:bookmarkEnd w:id="173"/>
+    <w:bookmarkStart w:id="174" w:name="gni-per-capita-projection"/>
     <w:p>
       <w:pPr>
         <w:pStyle w:val="Heading4"/>
@@ -27045,8 +27208,8 @@
         <w:t xml:space="preserve">, obtained by log-linear interpolation of five-year SSP nodes. This approach preserves observed GNI levels and applies only SSP-implied growth trajectories. A known limitation is that SSP projections provide GDP, not GNI, per capita; these series track closely for most countries but may diverge in economies with large net foreign income flows.</w:t>
       </w:r>
     </w:p>
-    <w:bookmarkEnd w:id="166"/>
-    <w:bookmarkStart w:id="167" w:name="value-of-a-statistical-life-year-vsly"/>
+    <w:bookmarkEnd w:id="174"/>
+    <w:bookmarkStart w:id="175" w:name="value-of-a-statistical-life-year-vsly"/>
     <w:p>
       <w:pPr>
         <w:pStyle w:val="Heading4"/>
@@ -27535,8 +27698,8 @@
         <w:t xml:space="preserve">.</w:t>
       </w:r>
     </w:p>
-    <w:bookmarkEnd w:id="167"/>
-    <w:bookmarkStart w:id="168" w:name="life-years-gained"/>
+    <w:bookmarkEnd w:id="175"/>
+    <w:bookmarkStart w:id="176" w:name="life-years-gained"/>
     <w:p>
       <w:pPr>
         <w:pStyle w:val="Heading4"/>
@@ -28308,8 +28471,8 @@
         <w:t xml:space="preserve">is the total number of deaths averted.</w:t>
       </w:r>
     </w:p>
-    <w:bookmarkEnd w:id="168"/>
-    <w:bookmarkStart w:id="169" w:name="discounting"/>
+    <w:bookmarkEnd w:id="176"/>
+    <w:bookmarkStart w:id="177" w:name="discounting"/>
     <w:p>
       <w:pPr>
         <w:pStyle w:val="Heading4"/>
@@ -28897,8 +29060,8 @@
         <w:t xml:space="preserve">is GNI per capita.</w:t>
       </w:r>
     </w:p>
-    <w:bookmarkEnd w:id="169"/>
-    <w:bookmarkStart w:id="170" w:name="parameter-summary"/>
+    <w:bookmarkEnd w:id="177"/>
+    <w:bookmarkStart w:id="178" w:name="parameter-summary"/>
     <w:p>
       <w:pPr>
         <w:pStyle w:val="Heading4"/>
@@ -28924,9 +29087,9 @@
         <w:tblLook w:firstRow="1" w:lastRow="0" w:firstColumn="0" w:lastColumn="0" w:noHBand="0" w:noVBand="0" w:val="0020"/>
       </w:tblPr>
       <w:tblGrid>
-        <w:gridCol w:w="2568"/>
-        <w:gridCol w:w="3424"/>
-        <w:gridCol w:w="1926"/>
+        <w:gridCol w:w="2640"/>
+        <w:gridCol w:w="3520"/>
+        <w:gridCol w:w="1760"/>
       </w:tblGrid>
       <w:tr>
         <w:trPr>
@@ -29010,7 +29173,7 @@
               <w:jc w:val="left"/>
             </w:pPr>
             <w:r>
-              <w:t xml:space="preserve">Robinson &amp; Hammitt (2011)</w:t>
+              <w:t xml:space="preserve">Robinson et al. (2019)</w:t>
             </w:r>
           </w:p>
         </w:tc>
@@ -29420,30 +29583,10 @@
         </w:tc>
       </w:tr>
     </w:tbl>
-    <w:p>
-      <w:pPr>
-        <w:pStyle w:val="BodyText"/>
-      </w:pPr>
-      <w:r>
-        <w:t xml:space="preserve">All economic valuation results reported in the main manuscript are computed using the above specifications, as implemented in</w:t>
-      </w:r>
-      <w:r>
-        <w:t xml:space="preserve"> </w:t>
-      </w:r>
-      <w:r>
-        <w:rPr>
-          <w:rStyle w:val="VerbatimChar"/>
-        </w:rPr>
-        <w:t xml:space="preserve">08_economic_value_calculation.R</w:t>
-      </w:r>
-      <w:r>
-        <w:t xml:space="preserve">.</w:t>
-      </w:r>
-    </w:p>
-    <w:bookmarkEnd w:id="170"/>
-    <w:bookmarkEnd w:id="171"/>
-    <w:bookmarkEnd w:id="172"/>
-    <w:bookmarkEnd w:id="173"/>
+    <w:bookmarkEnd w:id="178"/>
+    <w:bookmarkEnd w:id="179"/>
+    <w:bookmarkEnd w:id="180"/>
+    <w:bookmarkEnd w:id="181"/>
     <w:sectPr>
       <w:footnotePr>
         <w:numRestart w:val="eachSect"/>

</xml_diff>

<commit_message>
pre updating paper 1 to v2
</commit_message>
<xml_diff>
--- a/docs/who_cvd_targets_paper1.docx
+++ b/docs/who_cvd_targets_paper1.docx
@@ -1607,7 +1607,7 @@
         <w:pStyle w:val="BodyText"/>
       </w:pPr>
       <w:r>
-        <w:t xml:space="preserve">Males accounted for million averted deaths and females for million, consistent with higher age-specific CVD mortality rates in males. The relative contributions of hypertension control and lipid-lowering therapy were broadly similar in both sexes, although the absolute number of deaths averted was greater among males across all intervention scenarios (Figure</w:t>
+        <w:t xml:space="preserve">Males accounted for 30.4 million averted deaths and females for 35.2 million, consistent with higher age-specific CVD mortality rates in males. The relative contributions of hypertension control and lipid-lowering therapy were broadly similar in both sexes, although the absolute number of deaths averted was greater among males across all intervention scenarios (Figure</w:t>
       </w:r>
       <w:r>
         <w:t xml:space="preserve"> </w:t>
@@ -1617,6 +1617,14 @@
       </w:r>
       <w:r>
         <w:t xml:space="preserve">).</w:t>
+      </w:r>
+    </w:p>
+    <w:p>
+      <w:pPr>
+        <w:pStyle w:val="BodyText"/>
+      </w:pPr>
+      <w:r>
+        <w:t xml:space="preserve">The relevance of these intervention strategies extends beyond aggregate mortality reduction to the prevention of premature death among working-age populations. Of the 65.6 million deaths averted under the combined scenario, 18.4 million occurred among adults younger than 70 years — the age threshold used by SDG target 3.4 to define premature NCD mortality. This concentration of avertable deaths in younger age groups reflects both the high incidence of acute cardiovascular events in mid-life, particularly among males (30.4 million averted deaths in males versus 35.2 million in females), and the large treatment coverage gaps that persist in the age groups most affected by untreated hypertension and hypercholesterolaemia. Preventing these deaths has implications that reach beyond the health sector: premature CVD mortality removes economically active individuals from the labour force, reduces household income, and imposes caregiving burdens on surviving family members, with disproportionate consequences in low-income and lower-middle-income countries where social protection systems are weakest. The finding that a substantial fraction of avertable deaths falls within working-age populations strengthens the economic and equity case for accelerated scale-up of both hypertension control and lipid-lowering therapy.</w:t>
       </w:r>
     </w:p>
     <w:bookmarkEnd w:id="40"/>
@@ -1684,7 +1692,7 @@
     </w:p>
     <w:bookmarkEnd w:id="42"/>
     <w:bookmarkEnd w:id="43"/>
-    <w:bookmarkStart w:id="52" w:name="discussion"/>
+    <w:bookmarkStart w:id="53" w:name="discussion"/>
     <w:p>
       <w:pPr>
         <w:pStyle w:val="Heading1"/>
@@ -2082,7 +2090,7 @@
       </w:r>
     </w:p>
     <w:bookmarkEnd w:id="48"/>
-    <w:bookmarkStart w:id="49" w:name="relation-to-previous-literature"/>
+    <w:bookmarkStart w:id="49" w:name="economic-valuation"/>
     <w:p>
       <w:pPr>
         <w:pStyle w:val="Heading2"/>
@@ -2097,7 +2105,7 @@
         <w:tab/>
       </w:r>
       <w:r>
-        <w:t xml:space="preserve">Relation to previous literature</w:t>
+        <w:t xml:space="preserve">Economic valuation</w:t>
       </w:r>
     </w:p>
     <w:p>
@@ -2105,70 +2113,44 @@
         <w:pStyle w:val="FirstParagraph"/>
       </w:pPr>
       <w:r>
-        <w:t xml:space="preserve">Our findings are broadly consistent with, and extend, previous global and regional analyses. Kontis et al.</w:t>
-      </w:r>
-      <w:r>
-        <w:t xml:space="preserve"> </w:t>
-      </w:r>
-      <w:r>
-        <w:t xml:space="preserve">(2019)</w:t>
-      </w:r>
-      <w:r>
-        <w:t xml:space="preserve"> </w:t>
-      </w:r>
-      <w:r>
-        <w:t xml:space="preserve">projected the probability of achieving SDG target 3.4 (a one-third reduction in premature NCD mortality by 2030) and identified inadequate cardiovascular risk-factor control as a major barrier in most countries. The NCD Countdown analyses identified blood pressure management and statin therapy as among the most efficient interventions for reducing premature CVD mortality in low- and middle-income settings</w:t>
-      </w:r>
-      <w:r>
-        <w:t xml:space="preserve"> </w:t>
-      </w:r>
-      <w:r>
-        <w:t xml:space="preserve">(Watkins et al. 2022; Bennett et al. 2020)</w:t>
-      </w:r>
-      <w:r>
-        <w:t xml:space="preserve">. Our study complements this work by providing country-specific projections over a 25-year horizon, enabling direct comparison of the relative contribution of each intervention. The NCD Countdown 2025 benchmarking analysis further documented the widening gap in CVD mortality trends between high-income and low-income countries</w:t>
-      </w:r>
-      <w:r>
-        <w:t xml:space="preserve"> </w:t>
-      </w:r>
-      <w:r>
-        <w:t xml:space="preserve">(NCD Countdown 2030 collaborators 2025)</w:t>
-      </w:r>
-      <w:r>
-        <w:t xml:space="preserve">, lending additional urgency to the scale-up modelled here.</w:t>
-      </w:r>
-    </w:p>
-    <w:p>
-      <w:pPr>
-        <w:pStyle w:val="BodyText"/>
-      </w:pPr>
-      <w:r>
-        <w:t xml:space="preserve">The Ford et al. analysis of the decline in US coronary mortality attributed approximately half of the observed reduction to evidence-based treatments, including statins and antihypertensives, and the remainder to risk-factor improvements</w:t>
-      </w:r>
-      <w:r>
-        <w:t xml:space="preserve"> </w:t>
-      </w:r>
-      <w:r>
-        <w:t xml:space="preserve">(Ford et al. 2007)</w:t>
-      </w:r>
-      <w:r>
-        <w:t xml:space="preserve">. Similarly, Critchley et al.</w:t>
-      </w:r>
-      <w:r>
-        <w:t xml:space="preserve"> </w:t>
-      </w:r>
-      <w:r>
-        <w:t xml:space="preserve">(2004)</w:t>
-      </w:r>
-      <w:r>
-        <w:t xml:space="preserve"> </w:t>
-      </w:r>
-      <w:r>
-        <w:t xml:space="preserve">demonstrated that unfavourable risk-factor trends could offset treatment gains in rapidly developing countries. Our projections implicitly capture this tension by holding baseline risk-factor levels constant in the BAU scenario: the modelled health gains represent the incremental benefit of treatment scale-up above current trajectories.</w:t>
+        <w:t xml:space="preserve">The economic valuation reinforces the health case with a fiscal one. Under the combined scenario, the cumulative value of averted CVD mortality over 2026–2050, estimated using the value of a statistical life year approach discounted at 3%, amounted to US$62.1 trillion, equivalent to 1.5% of aggregate national income across 190 countries. These estimates are consistent in magnitude and methodology with recent global analyses that have quantified the economic value of reducing avoidable mortality. Chang et al.</w:t>
+      </w:r>
+      <w:r>
+        <w:t xml:space="preserve"> </w:t>
+      </w:r>
+      <w:r>
+        <w:t xml:space="preserve">(2024)</w:t>
+      </w:r>
+      <w:r>
+        <w:t xml:space="preserve"> </w:t>
+      </w:r>
+      <w:r>
+        <w:t xml:space="preserve">estimated that the total economic value of reducing avoidable mortality across all causes and countries was several multiples of global income, using a comparable income-elasticity transfer approach to derive country-specific VSL and VSLY values. Verguet et al.</w:t>
+      </w:r>
+      <w:r>
+        <w:t xml:space="preserve"> </w:t>
+      </w:r>
+      <w:r>
+        <w:t xml:space="preserve">(2024)</w:t>
+      </w:r>
+      <w:r>
+        <w:t xml:space="preserve"> </w:t>
+      </w:r>
+      <w:r>
+        <w:t xml:space="preserve">extended this framework to noncommunicable diseases and injuries specifically, demonstrating that the economic returns to NCD mortality reduction were concentrated in low-income and middle-income countries, where the gap between observed and achievable mortality is widest. Our findings align with this pattern: the intervention scenarios modelled here target precisely the conditions and populations identified in those analyses as offering the highest returns per dollar invested. That the economic value of averting CVD deaths through hypertension control and lipid-lowering therapy alone represents a substantial share of total avertable NCD mortality value underscores the outsized role that cardiovascular risk-factor management plays in the broader economic case for NCD investment</w:t>
+      </w:r>
+      <w:r>
+        <w:t xml:space="preserve"> </w:t>
+      </w:r>
+      <w:r>
+        <w:t xml:space="preserve">(Chang et al. 2024; Verguet et al. 2024)</w:t>
+      </w:r>
+      <w:r>
+        <w:t xml:space="preserve">.</w:t>
       </w:r>
     </w:p>
     <w:bookmarkEnd w:id="49"/>
-    <w:bookmarkStart w:id="50" w:name="strengths"/>
+    <w:bookmarkStart w:id="50" w:name="relation-to-previous-literature"/>
     <w:p>
       <w:pPr>
         <w:pStyle w:val="Heading2"/>
@@ -2183,7 +2165,7 @@
         <w:tab/>
       </w:r>
       <w:r>
-        <w:t xml:space="preserve">Strengths</w:t>
+        <w:t xml:space="preserve">Relation to previous literature</w:t>
       </w:r>
     </w:p>
     <w:p>
@@ -2191,11 +2173,70 @@
         <w:pStyle w:val="FirstParagraph"/>
       </w:pPr>
       <w:r>
-        <w:t xml:space="preserve">This study has several notable strengths. First, it offers truly global coverage, incorporating country-specific epidemiological and demographic inputs for 190 countries rather than relying on regional aggregates. Second, the model explicitly captures the interaction between hypertension control and statin therapy using a multiplicative framework, thereby avoiding the upward bias inherent in additive effect assumptions. Third, by drawing on GBD 2023 estimates, WHO Global Health Estimates, and UNWPP 2024 population projections, the analysis reflects the latest and most robust sources of global health and demographic data. Fourth, treatment effects are appropriately de-duplicated: only gains attributable to incremental coverage beyond baseline practice are counted, preventing double-counting of existing intervention benefits. Finally, the 25-year projection horizon allows the model to account for the cumulative impact of sustained reductions in key risk factors — effects that shorter-term analyses would fail to capture.</w:t>
+        <w:t xml:space="preserve">Our findings are broadly consistent with, and extend, previous global and regional analyses. Kontis et al.</w:t>
+      </w:r>
+      <w:r>
+        <w:t xml:space="preserve"> </w:t>
+      </w:r>
+      <w:r>
+        <w:t xml:space="preserve">(2019)</w:t>
+      </w:r>
+      <w:r>
+        <w:t xml:space="preserve"> </w:t>
+      </w:r>
+      <w:r>
+        <w:t xml:space="preserve">projected the probability of achieving SDG target 3.4 (a one-third reduction in premature NCD mortality by 2030) and identified inadequate cardiovascular risk-factor control as a major barrier in most countries. The NCD Countdown analyses identified blood pressure management and statin therapy as among the most efficient interventions for reducing premature CVD mortality in low- and middle-income settings</w:t>
+      </w:r>
+      <w:r>
+        <w:t xml:space="preserve"> </w:t>
+      </w:r>
+      <w:r>
+        <w:t xml:space="preserve">(Watkins et al. 2022; Bennett et al. 2020)</w:t>
+      </w:r>
+      <w:r>
+        <w:t xml:space="preserve">. Our study complements this work by providing country-specific projections over a 25-year horizon, enabling direct comparison of the relative contribution of each intervention. The NCD Countdown 2025 benchmarking analysis further documented the widening gap in CVD mortality trends between high-income and low-income countries</w:t>
+      </w:r>
+      <w:r>
+        <w:t xml:space="preserve"> </w:t>
+      </w:r>
+      <w:r>
+        <w:t xml:space="preserve">(NCD Countdown 2030 collaborators 2025)</w:t>
+      </w:r>
+      <w:r>
+        <w:t xml:space="preserve">, lending additional urgency to the scale-up modelled here.</w:t>
+      </w:r>
+    </w:p>
+    <w:p>
+      <w:pPr>
+        <w:pStyle w:val="BodyText"/>
+      </w:pPr>
+      <w:r>
+        <w:t xml:space="preserve">The Ford et al. analysis of the decline in US coronary mortality attributed approximately half of the observed reduction to evidence-based treatments, including statins and antihypertensives, and the remainder to risk-factor improvements</w:t>
+      </w:r>
+      <w:r>
+        <w:t xml:space="preserve"> </w:t>
+      </w:r>
+      <w:r>
+        <w:t xml:space="preserve">(Ford et al. 2007)</w:t>
+      </w:r>
+      <w:r>
+        <w:t xml:space="preserve">. Similarly, Critchley et al.</w:t>
+      </w:r>
+      <w:r>
+        <w:t xml:space="preserve"> </w:t>
+      </w:r>
+      <w:r>
+        <w:t xml:space="preserve">(2004)</w:t>
+      </w:r>
+      <w:r>
+        <w:t xml:space="preserve"> </w:t>
+      </w:r>
+      <w:r>
+        <w:t xml:space="preserve">demonstrated that unfavourable risk-factor trends could offset treatment gains in rapidly developing countries. Our projections implicitly capture this tension by holding baseline risk-factor levels constant in the BAU scenario: the modelled health gains represent the incremental benefit of treatment scale-up above current trajectories.</w:t>
       </w:r>
     </w:p>
     <w:bookmarkEnd w:id="50"/>
-    <w:bookmarkStart w:id="51" w:name="limitations"/>
+    <w:bookmarkStart w:id="51" w:name="strengths"/>
     <w:p>
       <w:pPr>
         <w:pStyle w:val="Heading2"/>
@@ -2210,6 +2251,33 @@
         <w:tab/>
       </w:r>
       <w:r>
+        <w:t xml:space="preserve">Strengths</w:t>
+      </w:r>
+    </w:p>
+    <w:p>
+      <w:pPr>
+        <w:pStyle w:val="FirstParagraph"/>
+      </w:pPr>
+      <w:r>
+        <w:t xml:space="preserve">This study has several notable strengths. First, it offers truly global coverage, incorporating country-specific epidemiological and demographic inputs for 190 countries rather than relying on regional aggregates. Second, the model explicitly captures the interaction between hypertension control and statin therapy using a multiplicative framework, thereby avoiding the upward bias inherent in additive effect assumptions. Third, by drawing on GBD 2023 estimates, WHO Global Health Estimates, and UNWPP 2024 population projections, the analysis reflects the latest and most robust sources of global health and demographic data. Fourth, treatment effects are appropriately de-duplicated: only gains attributable to incremental coverage beyond baseline practice are counted, preventing double-counting of existing intervention benefits. Finally, the 25-year projection horizon allows the model to account for the cumulative impact of sustained reductions in key risk factors — effects that shorter-term analyses would fail to capture.</w:t>
+      </w:r>
+    </w:p>
+    <w:bookmarkEnd w:id="51"/>
+    <w:bookmarkStart w:id="52" w:name="limitations"/>
+    <w:p>
+      <w:pPr>
+        <w:pStyle w:val="Heading2"/>
+      </w:pPr>
+      <w:r>
+        <w:rPr>
+          <w:rStyle w:val="SectionNumber"/>
+        </w:rPr>
+        <w:t xml:space="preserve">5.9</w:t>
+      </w:r>
+      <w:r>
+        <w:tab/>
+      </w:r>
+      <w:r>
         <w:t xml:space="preserve">Limitations</w:t>
       </w:r>
     </w:p>
@@ -2230,9 +2298,9 @@
         <w:t xml:space="preserve">. Fourth, the linear scale-up assumption (2026–2030) is a simplification; actual programme expansion may follow non-linear trajectories with initial delays and subsequent acceleration. Fifth, no explicit health-system capacity constraints were modelled, meaning that the scenarios represent technical potential rather than implementation-ready projections. Sixth, COVID-19 excess mortality was modelled only for 2020–2021, and potential long-term cardiovascular sequelae of SARS-CoV-2 infection were not incorporated. Finally, the model does not capture potential interactions between interventions and other concurrent NCD prevention strategies, such as dietary sodium reduction or trans-fat elimination, which may modify the marginal benefit of hypertension control and statin therapy.</w:t>
       </w:r>
     </w:p>
-    <w:bookmarkEnd w:id="51"/>
     <w:bookmarkEnd w:id="52"/>
-    <w:bookmarkStart w:id="53" w:name="conclusion"/>
+    <w:bookmarkEnd w:id="53"/>
+    <w:bookmarkStart w:id="54" w:name="conclusion"/>
     <w:p>
       <w:pPr>
         <w:pStyle w:val="Heading1"/>
@@ -2272,8 +2340,8 @@
         <w:br w:type="page"/>
       </w:r>
     </w:p>
-    <w:bookmarkEnd w:id="53"/>
-    <w:bookmarkStart w:id="114" w:name="references"/>
+    <w:bookmarkEnd w:id="54"/>
+    <w:bookmarkStart w:id="115" w:name="references"/>
     <w:p>
       <w:pPr>
         <w:pStyle w:val="Heading1"/>
@@ -2291,8 +2359,8 @@
         <w:t xml:space="preserve">References</w:t>
       </w:r>
     </w:p>
-    <w:bookmarkStart w:id="113" w:name="refs"/>
-    <w:bookmarkStart w:id="54" w:name="ref-Agboyibor2025CVHWHOAfrica"/>
+    <w:bookmarkStart w:id="114" w:name="refs"/>
+    <w:bookmarkStart w:id="55" w:name="ref-Agboyibor2025CVHWHOAfrica"/>
     <w:p>
       <w:pPr>
         <w:pStyle w:val="Bibliography"/>
@@ -2323,8 +2391,8 @@
         <w:t xml:space="preserve">10 (11): 1166–74.</w:t>
       </w:r>
     </w:p>
-    <w:bookmarkEnd w:id="54"/>
-    <w:bookmarkStart w:id="55" w:name="ref-ADAPP2025StandardsDiabetesCVD"/>
+    <w:bookmarkEnd w:id="55"/>
+    <w:bookmarkStart w:id="56" w:name="ref-ADAPP2025StandardsDiabetesCVD"/>
     <w:p>
       <w:pPr>
         <w:pStyle w:val="Bibliography"/>
@@ -2355,8 +2423,8 @@
         <w:t xml:space="preserve">48 (Supplement_1): S207–38.</w:t>
       </w:r>
     </w:p>
-    <w:bookmarkEnd w:id="55"/>
-    <w:bookmarkStart w:id="56" w:name="ref-Baigent2010IntensiveLDLLowering"/>
+    <w:bookmarkEnd w:id="56"/>
+    <w:bookmarkStart w:id="57" w:name="ref-Baigent2010IntensiveLDLLowering"/>
     <w:p>
       <w:pPr>
         <w:pStyle w:val="Bibliography"/>
@@ -2387,8 +2455,8 @@
         <w:t xml:space="preserve">376 (9753): 1670–81.</w:t>
       </w:r>
     </w:p>
-    <w:bookmarkEnd w:id="56"/>
-    <w:bookmarkStart w:id="58" w:name="ref-Banigbe2025"/>
+    <w:bookmarkEnd w:id="57"/>
+    <w:bookmarkStart w:id="59" w:name="ref-Banigbe2025"/>
     <w:p>
       <w:pPr>
         <w:pStyle w:val="Bibliography"/>
@@ -2421,7 +2489,7 @@
       <w:r>
         <w:t xml:space="preserve"> </w:t>
       </w:r>
-      <w:hyperlink r:id="rId57">
+      <w:hyperlink r:id="rId58">
         <w:r>
           <w:rPr>
             <w:rStyle w:val="Hyperlink"/>
@@ -2433,8 +2501,8 @@
         <w:t xml:space="preserve">.</w:t>
       </w:r>
     </w:p>
-    <w:bookmarkEnd w:id="58"/>
-    <w:bookmarkStart w:id="60" w:name="ref-Bennett2020NCD2030Path"/>
+    <w:bookmarkEnd w:id="59"/>
+    <w:bookmarkStart w:id="61" w:name="ref-Bennett2020NCD2030Path"/>
     <w:p>
       <w:pPr>
         <w:pStyle w:val="Bibliography"/>
@@ -2467,7 +2535,7 @@
       <w:r>
         <w:t xml:space="preserve"> </w:t>
       </w:r>
-      <w:hyperlink r:id="rId59">
+      <w:hyperlink r:id="rId60">
         <w:r>
           <w:rPr>
             <w:rStyle w:val="Hyperlink"/>
@@ -2479,8 +2547,8 @@
         <w:t xml:space="preserve">.</w:t>
       </w:r>
     </w:p>
-    <w:bookmarkEnd w:id="60"/>
-    <w:bookmarkStart w:id="61" w:name="X8bb68ddad385dfb3df8ce3d99f26cb5fc0511f6"/>
+    <w:bookmarkEnd w:id="61"/>
+    <w:bookmarkStart w:id="62" w:name="X8bb68ddad385dfb3df8ce3d99f26cb5fc0511f6"/>
     <w:p>
       <w:pPr>
         <w:pStyle w:val="Bibliography"/>
@@ -2511,8 +2579,8 @@
         <w:t xml:space="preserve">387 (11): 967–77.</w:t>
       </w:r>
     </w:p>
-    <w:bookmarkEnd w:id="61"/>
-    <w:bookmarkStart w:id="63" w:name="ref-Chang2024ECValue"/>
+    <w:bookmarkEnd w:id="62"/>
+    <w:bookmarkStart w:id="64" w:name="ref-Chang2024ECValue"/>
     <w:p>
       <w:pPr>
         <w:pStyle w:val="Bibliography"/>
@@ -2545,7 +2613,7 @@
       <w:r>
         <w:t xml:space="preserve"> </w:t>
       </w:r>
-      <w:hyperlink r:id="rId62">
+      <w:hyperlink r:id="rId63">
         <w:r>
           <w:rPr>
             <w:rStyle w:val="Hyperlink"/>
@@ -2557,8 +2625,8 @@
         <w:t xml:space="preserve">.</w:t>
       </w:r>
     </w:p>
-    <w:bookmarkEnd w:id="63"/>
-    <w:bookmarkStart w:id="65" w:name="ref-Chong2024"/>
+    <w:bookmarkEnd w:id="64"/>
+    <w:bookmarkStart w:id="66" w:name="ref-Chong2024"/>
     <w:p>
       <w:pPr>
         <w:pStyle w:val="Bibliography"/>
@@ -2588,7 +2656,7 @@
       <w:r>
         <w:t xml:space="preserve"> </w:t>
       </w:r>
-      <w:hyperlink r:id="rId64">
+      <w:hyperlink r:id="rId65">
         <w:r>
           <w:rPr>
             <w:rStyle w:val="Hyperlink"/>
@@ -2600,8 +2668,8 @@
         <w:t xml:space="preserve">.</w:t>
       </w:r>
     </w:p>
-    <w:bookmarkEnd w:id="65"/>
-    <w:bookmarkStart w:id="67" w:name="ref-Critchley2004"/>
+    <w:bookmarkEnd w:id="66"/>
+    <w:bookmarkStart w:id="68" w:name="ref-Critchley2004"/>
     <w:p>
       <w:pPr>
         <w:pStyle w:val="Bibliography"/>
@@ -2634,7 +2702,7 @@
       <w:r>
         <w:t xml:space="preserve"> </w:t>
       </w:r>
-      <w:hyperlink r:id="rId66">
+      <w:hyperlink r:id="rId67">
         <w:r>
           <w:rPr>
             <w:rStyle w:val="Hyperlink"/>
@@ -2646,8 +2714,8 @@
         <w:t xml:space="preserve">.</w:t>
       </w:r>
     </w:p>
-    <w:bookmarkEnd w:id="67"/>
-    <w:bookmarkStart w:id="69" w:name="ref-Ettehad2016"/>
+    <w:bookmarkEnd w:id="68"/>
+    <w:bookmarkStart w:id="70" w:name="ref-Ettehad2016"/>
     <w:p>
       <w:pPr>
         <w:pStyle w:val="Bibliography"/>
@@ -2680,7 +2748,7 @@
       <w:r>
         <w:t xml:space="preserve"> </w:t>
       </w:r>
-      <w:hyperlink r:id="rId68">
+      <w:hyperlink r:id="rId69">
         <w:r>
           <w:rPr>
             <w:rStyle w:val="Hyperlink"/>
@@ -2692,8 +2760,8 @@
         <w:t xml:space="preserve">.</w:t>
       </w:r>
     </w:p>
-    <w:bookmarkEnd w:id="69"/>
-    <w:bookmarkStart w:id="71" w:name="ref-Ford2007"/>
+    <w:bookmarkEnd w:id="70"/>
+    <w:bookmarkStart w:id="72" w:name="ref-Ford2007"/>
     <w:p>
       <w:pPr>
         <w:pStyle w:val="Bibliography"/>
@@ -2726,7 +2794,7 @@
       <w:r>
         <w:t xml:space="preserve"> </w:t>
       </w:r>
-      <w:hyperlink r:id="rId70">
+      <w:hyperlink r:id="rId71">
         <w:r>
           <w:rPr>
             <w:rStyle w:val="Hyperlink"/>
@@ -2738,8 +2806,8 @@
         <w:t xml:space="preserve">.</w:t>
       </w:r>
     </w:p>
-    <w:bookmarkEnd w:id="71"/>
-    <w:bookmarkStart w:id="73" w:name="ref-Fulcher2015"/>
+    <w:bookmarkEnd w:id="72"/>
+    <w:bookmarkStart w:id="74" w:name="ref-Fulcher2015"/>
     <w:p>
       <w:pPr>
         <w:pStyle w:val="Bibliography"/>
@@ -2772,7 +2840,7 @@
       <w:r>
         <w:t xml:space="preserve"> </w:t>
       </w:r>
-      <w:hyperlink r:id="rId72">
+      <w:hyperlink r:id="rId73">
         <w:r>
           <w:rPr>
             <w:rStyle w:val="Hyperlink"/>
@@ -2784,8 +2852,8 @@
         <w:t xml:space="preserve">.</w:t>
       </w:r>
     </w:p>
-    <w:bookmarkEnd w:id="73"/>
-    <w:bookmarkStart w:id="75" w:name="ref-Garcia2026HEARTS4Countries"/>
+    <w:bookmarkEnd w:id="74"/>
+    <w:bookmarkStart w:id="76" w:name="ref-Garcia2026HEARTS4Countries"/>
     <w:p>
       <w:pPr>
         <w:pStyle w:val="Bibliography"/>
@@ -2815,7 +2883,7 @@
       <w:r>
         <w:t xml:space="preserve">5: 102412. https://doi.org/</w:t>
       </w:r>
-      <w:hyperlink r:id="rId74">
+      <w:hyperlink r:id="rId75">
         <w:r>
           <w:rPr>
             <w:rStyle w:val="Hyperlink"/>
@@ -2827,8 +2895,8 @@
         <w:t xml:space="preserve">.</w:t>
       </w:r>
     </w:p>
-    <w:bookmarkEnd w:id="75"/>
-    <w:bookmarkStart w:id="76" w:name="ref-GBDCVD2025"/>
+    <w:bookmarkEnd w:id="76"/>
+    <w:bookmarkStart w:id="77" w:name="ref-GBDCVD2025"/>
     <w:p>
       <w:pPr>
         <w:pStyle w:val="Bibliography"/>
@@ -2859,8 +2927,8 @@
         <w:t xml:space="preserve">86 (22): 2167–2243.</w:t>
       </w:r>
     </w:p>
-    <w:bookmarkEnd w:id="76"/>
-    <w:bookmarkStart w:id="77" w:name="ref-Geldsetzer2019HypertensionCareLMICs"/>
+    <w:bookmarkEnd w:id="77"/>
+    <w:bookmarkStart w:id="78" w:name="ref-Geldsetzer2019HypertensionCareLMICs"/>
     <w:p>
       <w:pPr>
         <w:pStyle w:val="Bibliography"/>
@@ -2891,8 +2959,8 @@
         <w:t xml:space="preserve">394 (10199): 652–62.</w:t>
       </w:r>
     </w:p>
-    <w:bookmarkEnd w:id="77"/>
-    <w:bookmarkStart w:id="79" w:name="ref-ConsortiumRisk2023"/>
+    <w:bookmarkEnd w:id="78"/>
+    <w:bookmarkStart w:id="80" w:name="ref-ConsortiumRisk2023"/>
     <w:p>
       <w:pPr>
         <w:pStyle w:val="Bibliography"/>
@@ -2925,7 +2993,7 @@
       <w:r>
         <w:t xml:space="preserve"> </w:t>
       </w:r>
-      <w:hyperlink r:id="rId78">
+      <w:hyperlink r:id="rId79">
         <w:r>
           <w:rPr>
             <w:rStyle w:val="Hyperlink"/>
@@ -2937,8 +3005,8 @@
         <w:t xml:space="preserve">.</w:t>
       </w:r>
     </w:p>
-    <w:bookmarkEnd w:id="79"/>
-    <w:bookmarkStart w:id="80" w:name="ref-Gregg2023DiabetesCompactTargets"/>
+    <w:bookmarkEnd w:id="80"/>
+    <w:bookmarkStart w:id="81" w:name="ref-Gregg2023DiabetesCompactTargets"/>
     <w:p>
       <w:pPr>
         <w:pStyle w:val="Bibliography"/>
@@ -2969,8 +3037,8 @@
         <w:t xml:space="preserve">401 (10384): 1302–12.</w:t>
       </w:r>
     </w:p>
-    <w:bookmarkEnd w:id="80"/>
-    <w:bookmarkStart w:id="81" w:name="ref-Hunt2021GlobalDiabetesCompact"/>
+    <w:bookmarkEnd w:id="81"/>
+    <w:bookmarkStart w:id="82" w:name="ref-Hunt2021GlobalDiabetesCompact"/>
     <w:p>
       <w:pPr>
         <w:pStyle w:val="Bibliography"/>
@@ -3001,8 +3069,8 @@
         <w:t xml:space="preserve">9 (6): 325–27.</w:t>
       </w:r>
     </w:p>
-    <w:bookmarkEnd w:id="81"/>
-    <w:bookmarkStart w:id="83" w:name="ref-IIASA2024Gdp31"/>
+    <w:bookmarkEnd w:id="82"/>
+    <w:bookmarkStart w:id="84" w:name="ref-IIASA2024Gdp31"/>
     <w:p>
       <w:pPr>
         <w:pStyle w:val="Bibliography"/>
@@ -3019,7 +3087,7 @@
       <w:r>
         <w:t xml:space="preserve"> </w:t>
       </w:r>
-      <w:hyperlink r:id="rId82">
+      <w:hyperlink r:id="rId83">
         <w:r>
           <w:rPr>
             <w:rStyle w:val="Hyperlink"/>
@@ -3031,8 +3099,8 @@
         <w:t xml:space="preserve">.</w:t>
       </w:r>
     </w:p>
-    <w:bookmarkEnd w:id="83"/>
-    <w:bookmarkStart w:id="84" w:name="Xc6e08a70bb154acc484bdd41af662cc6d9fe479"/>
+    <w:bookmarkEnd w:id="84"/>
+    <w:bookmarkStart w:id="85" w:name="Xc6e08a70bb154acc484bdd41af662cc6d9fe479"/>
     <w:p>
       <w:pPr>
         <w:pStyle w:val="Bibliography"/>
@@ -3063,8 +3131,8 @@
         <w:t xml:space="preserve">10 (3): 224–33.</w:t>
       </w:r>
     </w:p>
-    <w:bookmarkEnd w:id="84"/>
-    <w:bookmarkStart w:id="86" w:name="ref-Kontis2019"/>
+    <w:bookmarkEnd w:id="85"/>
+    <w:bookmarkStart w:id="87" w:name="ref-Kontis2019"/>
     <w:p>
       <w:pPr>
         <w:pStyle w:val="Bibliography"/>
@@ -3097,7 +3165,7 @@
       <w:r>
         <w:t xml:space="preserve"> </w:t>
       </w:r>
-      <w:hyperlink r:id="rId85">
+      <w:hyperlink r:id="rId86">
         <w:r>
           <w:rPr>
             <w:rStyle w:val="Hyperlink"/>
@@ -3109,8 +3177,8 @@
         <w:t xml:space="preserve">.</w:t>
       </w:r>
     </w:p>
-    <w:bookmarkEnd w:id="86"/>
-    <w:bookmarkStart w:id="87" w:name="ref-Li2024HyperlipidemiaMedicinesAccess"/>
+    <w:bookmarkEnd w:id="87"/>
+    <w:bookmarkStart w:id="88" w:name="ref-Li2024HyperlipidemiaMedicinesAccess"/>
     <w:p>
       <w:pPr>
         <w:pStyle w:val="Bibliography"/>
@@ -3141,8 +3209,8 @@
         <w:t xml:space="preserve">4 (2): e0002905.</w:t>
       </w:r>
     </w:p>
-    <w:bookmarkEnd w:id="87"/>
-    <w:bookmarkStart w:id="88" w:name="ref-Li2024DiabetesCVDTargetsLMICs"/>
+    <w:bookmarkEnd w:id="88"/>
+    <w:bookmarkStart w:id="89" w:name="ref-Li2024DiabetesCVDTargetsLMICs"/>
     <w:p>
       <w:pPr>
         <w:pStyle w:val="Bibliography"/>
@@ -3173,8 +3241,8 @@
         <w:t xml:space="preserve">14: 04148.</w:t>
       </w:r>
     </w:p>
-    <w:bookmarkEnd w:id="88"/>
-    <w:bookmarkStart w:id="89" w:name="ref-Marcus2022StatinsLMICs"/>
+    <w:bookmarkEnd w:id="89"/>
+    <w:bookmarkStart w:id="90" w:name="ref-Marcus2022StatinsLMICs"/>
     <w:p>
       <w:pPr>
         <w:pStyle w:val="Bibliography"/>
@@ -3205,8 +3273,8 @@
         <w:t xml:space="preserve">10 (3): e369–79.</w:t>
       </w:r>
     </w:p>
-    <w:bookmarkEnd w:id="89"/>
-    <w:bookmarkStart w:id="90" w:name="ref-Mensah2023GlobalBurdenCVD"/>
+    <w:bookmarkEnd w:id="90"/>
+    <w:bookmarkStart w:id="91" w:name="ref-Mensah2023GlobalBurdenCVD"/>
     <w:p>
       <w:pPr>
         <w:pStyle w:val="Bibliography"/>
@@ -3237,8 +3305,8 @@
         <w:t xml:space="preserve">82 (25): 2350–2473.</w:t>
       </w:r>
     </w:p>
-    <w:bookmarkEnd w:id="90"/>
-    <w:bookmarkStart w:id="92" w:name="ref-Moran2024"/>
+    <w:bookmarkEnd w:id="91"/>
+    <w:bookmarkStart w:id="93" w:name="ref-Moran2024"/>
     <w:p>
       <w:pPr>
         <w:pStyle w:val="Bibliography"/>
@@ -3271,7 +3339,7 @@
       <w:r>
         <w:t xml:space="preserve"> </w:t>
       </w:r>
-      <w:hyperlink r:id="rId91">
+      <w:hyperlink r:id="rId92">
         <w:r>
           <w:rPr>
             <w:rStyle w:val="Hyperlink"/>
@@ -3283,8 +3351,8 @@
         <w:t xml:space="preserve">.</w:t>
       </w:r>
     </w:p>
-    <w:bookmarkEnd w:id="92"/>
-    <w:bookmarkStart w:id="93" w:name="ref-Moran2023GlobalHEARTSImplementation"/>
+    <w:bookmarkEnd w:id="93"/>
+    <w:bookmarkStart w:id="94" w:name="ref-Moran2023GlobalHEARTSImplementation"/>
     <w:p>
       <w:pPr>
         <w:pStyle w:val="Bibliography"/>
@@ -3315,8 +3383,8 @@
         <w:t xml:space="preserve">82 (19): 1868–84.</w:t>
       </w:r>
     </w:p>
-    <w:bookmarkEnd w:id="93"/>
-    <w:bookmarkStart w:id="94" w:name="ref-Nambiema2025HypertensionAfrica"/>
+    <w:bookmarkEnd w:id="94"/>
+    <w:bookmarkStart w:id="95" w:name="ref-Nambiema2025HypertensionAfrica"/>
     <w:p>
       <w:pPr>
         <w:pStyle w:val="Bibliography"/>
@@ -3347,8 +3415,8 @@
         <w:t xml:space="preserve">86 (23): 2263–88.</w:t>
       </w:r>
     </w:p>
-    <w:bookmarkEnd w:id="94"/>
-    <w:bookmarkStart w:id="95" w:name="ref-NCDCountdown2025BenchmarkingProgress"/>
+    <w:bookmarkEnd w:id="95"/>
+    <w:bookmarkStart w:id="96" w:name="ref-NCDCountdown2025BenchmarkingProgress"/>
     <w:p>
       <w:pPr>
         <w:pStyle w:val="Bibliography"/>
@@ -3379,8 +3447,8 @@
         <w:t xml:space="preserve">406 (10509): 1255–82.</w:t>
       </w:r>
     </w:p>
-    <w:bookmarkEnd w:id="95"/>
-    <w:bookmarkStart w:id="96" w:name="ref-Petty1999IschemicStrokeSubtypes"/>
+    <w:bookmarkEnd w:id="96"/>
+    <w:bookmarkStart w:id="97" w:name="ref-Petty1999IschemicStrokeSubtypes"/>
     <w:p>
       <w:pPr>
         <w:pStyle w:val="Bibliography"/>
@@ -3411,8 +3479,8 @@
         <w:t xml:space="preserve">30 (12): 2513–16.</w:t>
       </w:r>
     </w:p>
-    <w:bookmarkEnd w:id="96"/>
-    <w:bookmarkStart w:id="98" w:name="ref-Pickersgill2022"/>
+    <w:bookmarkEnd w:id="97"/>
+    <w:bookmarkStart w:id="99" w:name="ref-Pickersgill2022"/>
     <w:p>
       <w:pPr>
         <w:pStyle w:val="Bibliography"/>
@@ -3445,7 +3513,7 @@
       <w:r>
         <w:t xml:space="preserve"> </w:t>
       </w:r>
-      <w:hyperlink r:id="rId97">
+      <w:hyperlink r:id="rId98">
         <w:r>
           <w:rPr>
             <w:rStyle w:val="Hyperlink"/>
@@ -3457,8 +3525,8 @@
         <w:t xml:space="preserve">.</w:t>
       </w:r>
     </w:p>
-    <w:bookmarkEnd w:id="98"/>
-    <w:bookmarkStart w:id="99" w:name="ref-Reith2026StatinAdverseEffects"/>
+    <w:bookmarkEnd w:id="99"/>
+    <w:bookmarkStart w:id="100" w:name="ref-Reith2026StatinAdverseEffects"/>
     <w:p>
       <w:pPr>
         <w:pStyle w:val="Bibliography"/>
@@ -3489,8 +3557,8 @@
         <w:t xml:space="preserve">407 (10529): 689–703.</w:t>
       </w:r>
     </w:p>
-    <w:bookmarkEnd w:id="99"/>
-    <w:bookmarkStart w:id="101" w:name="ref-Robinson19BCA"/>
+    <w:bookmarkEnd w:id="100"/>
+    <w:bookmarkStart w:id="102" w:name="ref-Robinson19BCA"/>
     <w:p>
       <w:pPr>
         <w:pStyle w:val="Bibliography"/>
@@ -3520,7 +3588,7 @@
       <w:r>
         <w:t xml:space="preserve"> </w:t>
       </w:r>
-      <w:hyperlink r:id="rId100">
+      <w:hyperlink r:id="rId101">
         <w:r>
           <w:rPr>
             <w:rStyle w:val="Hyperlink"/>
@@ -3532,8 +3600,8 @@
         <w:t xml:space="preserve">.</w:t>
       </w:r>
     </w:p>
-    <w:bookmarkEnd w:id="101"/>
-    <w:bookmarkStart w:id="103" w:name="ref-Robinson2019VSL"/>
+    <w:bookmarkEnd w:id="102"/>
+    <w:bookmarkStart w:id="104" w:name="ref-Robinson2019VSL"/>
     <w:p>
       <w:pPr>
         <w:pStyle w:val="Bibliography"/>
@@ -3566,7 +3634,7 @@
       <w:r>
         <w:t xml:space="preserve"> </w:t>
       </w:r>
-      <w:hyperlink r:id="rId102">
+      <w:hyperlink r:id="rId103">
         <w:r>
           <w:rPr>
             <w:rStyle w:val="Hyperlink"/>
@@ -3578,8 +3646,8 @@
         <w:t xml:space="preserve">.</w:t>
       </w:r>
     </w:p>
-    <w:bookmarkEnd w:id="103"/>
-    <w:bookmarkStart w:id="104" w:name="ref-Lancet2025TurnTideNCDs"/>
+    <w:bookmarkEnd w:id="104"/>
+    <w:bookmarkStart w:id="105" w:name="ref-Lancet2025TurnTideNCDs"/>
     <w:p>
       <w:pPr>
         <w:pStyle w:val="Bibliography"/>
@@ -3610,8 +3678,8 @@
         <w:t xml:space="preserve">405 (10472): 1.</w:t>
       </w:r>
     </w:p>
-    <w:bookmarkEnd w:id="104"/>
-    <w:bookmarkStart w:id="106" w:name="ref-Verguet2024ECValue"/>
+    <w:bookmarkEnd w:id="105"/>
+    <w:bookmarkStart w:id="107" w:name="ref-Verguet2024ECValue"/>
     <w:p>
       <w:pPr>
         <w:pStyle w:val="Bibliography"/>
@@ -3644,7 +3712,7 @@
       <w:r>
         <w:t xml:space="preserve"> </w:t>
       </w:r>
-      <w:hyperlink r:id="rId105">
+      <w:hyperlink r:id="rId106">
         <w:r>
           <w:rPr>
             <w:rStyle w:val="Hyperlink"/>
@@ -3656,8 +3724,8 @@
         <w:t xml:space="preserve">.</w:t>
       </w:r>
     </w:p>
-    <w:bookmarkEnd w:id="106"/>
-    <w:bookmarkStart w:id="108" w:name="ref-Vollset2024"/>
+    <w:bookmarkEnd w:id="107"/>
+    <w:bookmarkStart w:id="109" w:name="ref-Vollset2024"/>
     <w:p>
       <w:pPr>
         <w:pStyle w:val="Bibliography"/>
@@ -3690,7 +3758,7 @@
       <w:r>
         <w:t xml:space="preserve"> </w:t>
       </w:r>
-      <w:hyperlink r:id="rId107">
+      <w:hyperlink r:id="rId108">
         <w:r>
           <w:rPr>
             <w:rStyle w:val="Hyperlink"/>
@@ -3702,8 +3770,8 @@
         <w:t xml:space="preserve">.</w:t>
       </w:r>
     </w:p>
-    <w:bookmarkEnd w:id="108"/>
-    <w:bookmarkStart w:id="110" w:name="ref-Watkins2022NCD2030"/>
+    <w:bookmarkEnd w:id="109"/>
+    <w:bookmarkStart w:id="111" w:name="ref-Watkins2022NCD2030"/>
     <w:p>
       <w:pPr>
         <w:pStyle w:val="Bibliography"/>
@@ -3736,7 +3804,7 @@
       <w:r>
         <w:t xml:space="preserve"> </w:t>
       </w:r>
-      <w:hyperlink r:id="rId109">
+      <w:hyperlink r:id="rId110">
         <w:r>
           <w:rPr>
             <w:rStyle w:val="Hyperlink"/>
@@ -3748,8 +3816,8 @@
         <w:t xml:space="preserve">.</w:t>
       </w:r>
     </w:p>
-    <w:bookmarkEnd w:id="110"/>
-    <w:bookmarkStart w:id="111" w:name="ref-WHO2011NCDMonitoringFramework"/>
+    <w:bookmarkEnd w:id="111"/>
+    <w:bookmarkStart w:id="112" w:name="ref-WHO2011NCDMonitoringFramework"/>
     <w:p>
       <w:pPr>
         <w:pStyle w:val="Bibliography"/>
@@ -3770,8 +3838,8 @@
         <w:t xml:space="preserve">World Health Organization.</w:t>
       </w:r>
     </w:p>
-    <w:bookmarkEnd w:id="111"/>
-    <w:bookmarkStart w:id="112" w:name="ref-WHO2025HypertensionReport"/>
+    <w:bookmarkEnd w:id="112"/>
+    <w:bookmarkStart w:id="113" w:name="ref-WHO2025HypertensionReport"/>
     <w:p>
       <w:pPr>
         <w:pStyle w:val="Bibliography"/>
@@ -3793,15 +3861,15 @@
         <w:t xml:space="preserve">. World Health Organization.</w:t>
       </w:r>
     </w:p>
-    <w:bookmarkEnd w:id="112"/>
     <w:bookmarkEnd w:id="113"/>
+    <w:bookmarkEnd w:id="114"/>
     <w:p>
       <w:r>
         <w:br w:type="page"/>
       </w:r>
     </w:p>
-    <w:bookmarkEnd w:id="114"/>
-    <w:bookmarkStart w:id="115" w:name="tables"/>
+    <w:bookmarkEnd w:id="115"/>
+    <w:bookmarkStart w:id="116" w:name="tables"/>
     <w:p>
       <w:pPr>
         <w:pStyle w:val="Heading1"/>
@@ -6125,8 +6193,8 @@
         <w:br w:type="page"/>
       </w:r>
     </w:p>
-    <w:bookmarkEnd w:id="115"/>
-    <w:bookmarkStart w:id="124" w:name="figures"/>
+    <w:bookmarkEnd w:id="116"/>
+    <w:bookmarkStart w:id="125" w:name="figures"/>
     <w:p>
       <w:pPr>
         <w:pStyle w:val="Heading1"/>
@@ -6171,18 +6239,18 @@
           <wp:inline>
             <wp:extent cx="5334000" cy="2424545"/>
             <wp:effectExtent b="0" l="0" r="0" t="0"/>
-            <wp:docPr descr="Figure 9.1: Note: Lines represent the running total of deaths averted for each individual intervention relative to business-as-usual." title="" id="117" name="Picture"/>
+            <wp:docPr descr="Figure 9.1: Note: Lines represent the running total of deaths averted for each individual intervention relative to business-as-usual." title="" id="118" name="Picture"/>
             <a:graphic>
               <a:graphicData uri="http://schemas.openxmlformats.org/drawingml/2006/picture">
                 <pic:pic>
                   <pic:nvPicPr>
-                    <pic:cNvPr descr="../output/aim1_fig4_cum_averted.png" id="118" name="Picture"/>
+                    <pic:cNvPr descr="../output/aim1_fig4_cum_averted.png" id="119" name="Picture"/>
                     <pic:cNvPicPr>
                       <a:picLocks noChangeArrowheads="1" noChangeAspect="1"/>
                     </pic:cNvPicPr>
                   </pic:nvPicPr>
                   <pic:blipFill>
-                    <a:blip r:embed="rId116"/>
+                    <a:blip r:embed="rId117"/>
                     <a:stretch>
                       <a:fillRect/>
                     </a:stretch>
@@ -6213,8 +6281,8 @@
       <w:pPr>
         <w:pStyle w:val="ImageCaption"/>
       </w:pPr>
-      <w:bookmarkStart w:id="119" w:name="fig:fig4-paper"/>
-      <w:bookmarkEnd w:id="119"/>
+      <w:bookmarkStart w:id="120" w:name="fig:fig4-paper"/>
+      <w:bookmarkEnd w:id="120"/>
       <w:r>
         <w:t xml:space="preserve">Figure 9.1: Note: Lines represent the running total of deaths averted for each individual intervention relative to business-as-usual.</w:t>
       </w:r>
@@ -6251,18 +6319,18 @@
           <wp:inline>
             <wp:extent cx="5334000" cy="2667000"/>
             <wp:effectExtent b="0" l="0" r="0" t="0"/>
-            <wp:docPr descr="Figure 9.2: Note: Distribution of projected benefits by age and sex. Adults aged 70 years and older account for the majority of averted deaths across all interventions, consistent with the age-dependent increase in baseline CVD mortality." title="" id="121" name="Picture"/>
+            <wp:docPr descr="Figure 9.2: Note: Distribution of projected benefits by age and sex. Adults aged 70 years and older account for the majority of averted deaths across all interventions, consistent with the age-dependent increase in baseline CVD mortality." title="" id="122" name="Picture"/>
             <a:graphic>
               <a:graphicData uri="http://schemas.openxmlformats.org/drawingml/2006/picture">
                 <pic:pic>
                   <pic:nvPicPr>
-                    <pic:cNvPr descr="../output/aim1_fig5_demo_age.png" id="122" name="Picture"/>
+                    <pic:cNvPr descr="../output/aim1_fig5_demo_age.png" id="123" name="Picture"/>
                     <pic:cNvPicPr>
                       <a:picLocks noChangeArrowheads="1" noChangeAspect="1"/>
                     </pic:cNvPicPr>
                   </pic:nvPicPr>
                   <pic:blipFill>
-                    <a:blip r:embed="rId120"/>
+                    <a:blip r:embed="rId121"/>
                     <a:stretch>
                       <a:fillRect/>
                     </a:stretch>
@@ -6293,8 +6361,8 @@
       <w:pPr>
         <w:pStyle w:val="ImageCaption"/>
       </w:pPr>
-      <w:bookmarkStart w:id="123" w:name="fig:fig6-paper"/>
-      <w:bookmarkEnd w:id="123"/>
+      <w:bookmarkStart w:id="124" w:name="fig:fig6-paper"/>
+      <w:bookmarkEnd w:id="124"/>
       <w:r>
         <w:t xml:space="preserve">Figure 9.2: Note: Distribution of projected benefits by age and sex. Adults aged 70 years and older account for the majority of averted deaths across all interventions, consistent with the age-dependent increase in baseline CVD mortality.</w:t>
       </w:r>
@@ -6304,8 +6372,8 @@
         <w:br w:type="page"/>
       </w:r>
     </w:p>
-    <w:bookmarkEnd w:id="124"/>
-    <w:bookmarkStart w:id="181" w:name="supplemental-material"/>
+    <w:bookmarkEnd w:id="125"/>
+    <w:bookmarkStart w:id="182" w:name="supplemental-material"/>
     <w:p>
       <w:pPr>
         <w:pStyle w:val="Heading1"/>
@@ -6323,7 +6391,7 @@
         <w:t xml:space="preserve">Supplemental Material</w:t>
       </w:r>
     </w:p>
-    <w:bookmarkStart w:id="125" w:name="supplemental-tables"/>
+    <w:bookmarkStart w:id="126" w:name="supplemental-tables"/>
     <w:p>
       <w:pPr>
         <w:pStyle w:val="Heading2"/>
@@ -6381,8 +6449,8 @@
         <w:t xml:space="preserve">See Tables 4–5 for WHO region and World Bank income group breakdowns.</w:t>
       </w:r>
     </w:p>
-    <w:bookmarkEnd w:id="125"/>
-    <w:bookmarkStart w:id="161" w:name="supplemental-figures"/>
+    <w:bookmarkEnd w:id="126"/>
+    <w:bookmarkStart w:id="162" w:name="supplemental-figures"/>
     <w:p>
       <w:pPr>
         <w:pStyle w:val="Heading2"/>
@@ -6421,18 +6489,18 @@
           <wp:inline>
             <wp:extent cx="5334000" cy="2057400"/>
             <wp:effectExtent b="0" l="0" r="0" t="0"/>
-            <wp:docPr descr="" title="" id="127" name="Picture"/>
+            <wp:docPr descr="" title="" id="128" name="Picture"/>
             <a:graphic>
               <a:graphicData uri="http://schemas.openxmlformats.org/drawingml/2006/picture">
                 <pic:pic>
                   <pic:nvPicPr>
-                    <pic:cNvPr descr="who_cvd_targets_paper1_files/figure-docx/state-diagram-1.png" id="128" name="Picture"/>
+                    <pic:cNvPr descr="who_cvd_targets_paper1_files/figure-docx/state-diagram-1.png" id="129" name="Picture"/>
                     <pic:cNvPicPr>
                       <a:picLocks noChangeArrowheads="1" noChangeAspect="1"/>
                     </pic:cNvPicPr>
                   </pic:nvPicPr>
                   <pic:blipFill>
-                    <a:blip r:embed="rId126"/>
+                    <a:blip r:embed="rId127"/>
                     <a:stretch>
                       <a:fillRect/>
                     </a:stretch>
@@ -6586,18 +6654,18 @@
           <wp:inline>
             <wp:extent cx="5334000" cy="2424545"/>
             <wp:effectExtent b="0" l="0" r="0" t="0"/>
-            <wp:docPr descr="Figure 10.1: Note: Four causes are modelled jointly: ischaemic heart disease, ischaemic stroke, intracerebral haemorrhage, and hypertensive heart disease. Under the business-as-usual scenario, hypertension control and statin coverage remain at 2024 levels through 2050. Population denominators from UNWPP 2024; epidemiological inputs from GBD 2023." title="" id="130" name="Picture"/>
+            <wp:docPr descr="Figure 10.1: Note: Four causes are modelled jointly: ischaemic heart disease, ischaemic stroke, intracerebral haemorrhage, and hypertensive heart disease. Under the business-as-usual scenario, hypertension control and statin coverage remain at 2024 levels through 2050. Population denominators from UNWPP 2024; epidemiological inputs from GBD 2023." title="" id="131" name="Picture"/>
             <a:graphic>
               <a:graphicData uri="http://schemas.openxmlformats.org/drawingml/2006/picture">
                 <pic:pic>
                   <pic:nvPicPr>
-                    <pic:cNvPr descr="../output/aim1_disease_trend.png" id="131" name="Picture"/>
+                    <pic:cNvPr descr="../output/aim1_disease_trend.png" id="132" name="Picture"/>
                     <pic:cNvPicPr>
                       <a:picLocks noChangeArrowheads="1" noChangeAspect="1"/>
                     </pic:cNvPicPr>
                   </pic:nvPicPr>
                   <pic:blipFill>
-                    <a:blip r:embed="rId129"/>
+                    <a:blip r:embed="rId130"/>
                     <a:stretch>
                       <a:fillRect/>
                     </a:stretch>
@@ -6628,8 +6696,8 @@
       <w:pPr>
         <w:pStyle w:val="ImageCaption"/>
       </w:pPr>
-      <w:bookmarkStart w:id="132" w:name="fig:fig1-paper"/>
-      <w:bookmarkEnd w:id="132"/>
+      <w:bookmarkStart w:id="133" w:name="fig:fig1-paper"/>
+      <w:bookmarkEnd w:id="133"/>
       <w:r>
         <w:t xml:space="preserve">Figure 10.1: Note: Four causes are modelled jointly: ischaemic heart disease, ischaemic stroke, intracerebral haemorrhage, and hypertensive heart disease. Under the business-as-usual scenario, hypertension control and statin coverage remain at 2024 levels through 2050. Population denominators from UNWPP 2024; epidemiological inputs from GBD 2023.</w:t>
       </w:r>
@@ -6666,18 +6734,18 @@
           <wp:inline>
             <wp:extent cx="5334000" cy="2963333"/>
             <wp:effectExtent b="0" l="0" r="0" t="0"/>
-            <wp:docPr descr="Figure 10.2: Note: Each bar represents the total number of CVD deaths averted relative to the business-as-usual scenario over 2026–2050 across all modelled countries. Interventions include hypertension control in the general population (50% control by 2030), hypertension control among people with diabetes (80% control by 2030), lipid-lowering therapy (50% statin coverage by 2030), and all three combined. All four CVD causes combined: ischaemic heart disease, ischaemic stroke, intracerebral haemorrhage, and hypertensive heart disease." title="" id="134" name="Picture"/>
+            <wp:docPr descr="Figure 10.2: Note: Each bar represents the total number of CVD deaths averted relative to the business-as-usual scenario over 2026–2050 across all modelled countries. Interventions include hypertension control in the general population (50% control by 2030), hypertension control among people with diabetes (80% control by 2030), lipid-lowering therapy (50% statin coverage by 2030), and all three combined. All four CVD causes combined: ischaemic heart disease, ischaemic stroke, intracerebral haemorrhage, and hypertensive heart disease." title="" id="135" name="Picture"/>
             <a:graphic>
               <a:graphicData uri="http://schemas.openxmlformats.org/drawingml/2006/picture">
                 <pic:pic>
                   <pic:nvPicPr>
-                    <pic:cNvPr descr="../output/aim1_fig1_deaths_intervention.png" id="135" name="Picture"/>
+                    <pic:cNvPr descr="../output/aim1_fig1_deaths_intervention.png" id="136" name="Picture"/>
                     <pic:cNvPicPr>
                       <a:picLocks noChangeArrowheads="1" noChangeAspect="1"/>
                     </pic:cNvPicPr>
                   </pic:nvPicPr>
                   <pic:blipFill>
-                    <a:blip r:embed="rId133"/>
+                    <a:blip r:embed="rId134"/>
                     <a:stretch>
                       <a:fillRect/>
                     </a:stretch>
@@ -6708,8 +6776,8 @@
       <w:pPr>
         <w:pStyle w:val="ImageCaption"/>
       </w:pPr>
-      <w:bookmarkStart w:id="136" w:name="fig:fig2-paper"/>
-      <w:bookmarkEnd w:id="136"/>
+      <w:bookmarkStart w:id="137" w:name="fig:fig2-paper"/>
+      <w:bookmarkEnd w:id="137"/>
       <w:r>
         <w:t xml:space="preserve">Figure 10.2: Note: Each bar represents the total number of CVD deaths averted relative to the business-as-usual scenario over 2026–2050 across all modelled countries. Interventions include hypertension control in the general population (50% control by 2030), hypertension control among people with diabetes (80% control by 2030), lipid-lowering therapy (50% statin coverage by 2030), and all three combined. All four CVD causes combined: ischaemic heart disease, ischaemic stroke, intracerebral haemorrhage, and hypertensive heart disease.</w:t>
       </w:r>
@@ -6746,18 +6814,18 @@
           <wp:inline>
             <wp:extent cx="5334000" cy="2424545"/>
             <wp:effectExtent b="0" l="0" r="0" t="0"/>
-            <wp:docPr descr="Figure 10.3: Note: The stacked area chart shows annual deaths averted by each intervention relative to business-as-usual across all modelled countries. Interventions scale up linearly from 2026 to 2030 and are sustained through 2050. Gains accelerate after 2030 as sustained coverage compounds cumulative risk reduction." title="" id="138" name="Picture"/>
+            <wp:docPr descr="Figure 10.3: Note: The stacked area chart shows annual deaths averted by each intervention relative to business-as-usual across all modelled countries. Interventions scale up linearly from 2026 to 2030 and are sustained through 2050. Gains accelerate after 2030 as sustained coverage compounds cumulative risk reduction." title="" id="139" name="Picture"/>
             <a:graphic>
               <a:graphicData uri="http://schemas.openxmlformats.org/drawingml/2006/picture">
                 <pic:pic>
                   <pic:nvPicPr>
-                    <pic:cNvPr descr="../output/aim1_fig3_annual_averted.png" id="139" name="Picture"/>
+                    <pic:cNvPr descr="../output/aim1_fig3_annual_averted.png" id="140" name="Picture"/>
                     <pic:cNvPicPr>
                       <a:picLocks noChangeArrowheads="1" noChangeAspect="1"/>
                     </pic:cNvPicPr>
                   </pic:nvPicPr>
                   <pic:blipFill>
-                    <a:blip r:embed="rId137"/>
+                    <a:blip r:embed="rId138"/>
                     <a:stretch>
                       <a:fillRect/>
                     </a:stretch>
@@ -6788,8 +6856,8 @@
       <w:pPr>
         <w:pStyle w:val="ImageCaption"/>
       </w:pPr>
-      <w:bookmarkStart w:id="140" w:name="fig:fig3-paper"/>
-      <w:bookmarkEnd w:id="140"/>
+      <w:bookmarkStart w:id="141" w:name="fig:fig3-paper"/>
+      <w:bookmarkEnd w:id="141"/>
       <w:r>
         <w:t xml:space="preserve">Figure 10.3: Note: The stacked area chart shows annual deaths averted by each intervention relative to business-as-usual across all modelled countries. Interventions scale up linearly from 2026 to 2030 and are sustained through 2050. Gains accelerate after 2030 as sustained coverage compounds cumulative risk reduction.</w:t>
       </w:r>
@@ -6826,18 +6894,18 @@
           <wp:inline>
             <wp:extent cx="5334000" cy="2667000"/>
             <wp:effectExtent b="0" l="0" r="0" t="0"/>
-            <wp:docPr descr="Figure 10.4: Note: Age-standardised CVD mortality rate across all modelled countries by intervention scenario. Solid lines represent the calibration period (2019–2025); dashed lines represent the projection period (2026–2050). ASMR computed using the WHO World Standard Population, rescaled to ages 20–95+. Interventions scale up linearly from 2026 to 2030." title="" id="142" name="Picture"/>
+            <wp:docPr descr="Figure 10.4: Note: Age-standardised CVD mortality rate across all modelled countries by intervention scenario. Solid lines represent the calibration period (2019–2025); dashed lines represent the projection period (2026–2050). ASMR computed using the WHO World Standard Population, rescaled to ages 20–95+. Interventions scale up linearly from 2026 to 2030." title="" id="143" name="Picture"/>
             <a:graphic>
               <a:graphicData uri="http://schemas.openxmlformats.org/drawingml/2006/picture">
                 <pic:pic>
                   <pic:nvPicPr>
-                    <pic:cNvPr descr="../output/aim1_asmr_interventions.png" id="143" name="Picture"/>
+                    <pic:cNvPr descr="../output/aim1_asmr_interventions.png" id="144" name="Picture"/>
                     <pic:cNvPicPr>
                       <a:picLocks noChangeArrowheads="1" noChangeAspect="1"/>
                     </pic:cNvPicPr>
                   </pic:nvPicPr>
                   <pic:blipFill>
-                    <a:blip r:embed="rId141"/>
+                    <a:blip r:embed="rId142"/>
                     <a:stretch>
                       <a:fillRect/>
                     </a:stretch>
@@ -6868,8 +6936,8 @@
       <w:pPr>
         <w:pStyle w:val="ImageCaption"/>
       </w:pPr>
-      <w:bookmarkStart w:id="144" w:name="fig:fig7-paper"/>
-      <w:bookmarkEnd w:id="144"/>
+      <w:bookmarkStart w:id="145" w:name="fig:fig7-paper"/>
+      <w:bookmarkEnd w:id="145"/>
       <w:r>
         <w:t xml:space="preserve">Figure 10.4: Note: Age-standardised CVD mortality rate across all modelled countries by intervention scenario. Solid lines represent the calibration period (2019–2025); dashed lines represent the projection period (2026–2050). ASMR computed using the WHO World Standard Population, rescaled to ages 20–95+. Interventions scale up linearly from 2026 to 2030.</w:t>
       </w:r>
@@ -6906,18 +6974,18 @@
           <wp:inline>
             <wp:extent cx="5334000" cy="2963333"/>
             <wp:effectExtent b="0" l="0" r="0" t="0"/>
-            <wp:docPr descr="Figure 10.5: Note: Cumulative CVD deaths averted relative to business-as-usual across all modelled countries, stratified by cause of death and intervention scenario. Ischaemic heart disease accounts for the largest share of averted deaths across all interventions. Statin effects are restricted to ischaemic heart disease and ischaemic stroke; hypertension control affects all four causes." title="" id="146" name="Picture"/>
+            <wp:docPr descr="Figure 10.5: Note: Cumulative CVD deaths averted relative to business-as-usual across all modelled countries, stratified by cause of death and intervention scenario. Ischaemic heart disease accounts for the largest share of averted deaths across all interventions. Statin effects are restricted to ischaemic heart disease and ischaemic stroke; hypertension control affects all four causes." title="" id="147" name="Picture"/>
             <a:graphic>
               <a:graphicData uri="http://schemas.openxmlformats.org/drawingml/2006/picture">
                 <pic:pic>
                   <pic:nvPicPr>
-                    <pic:cNvPr descr="../output/aim1_fig2_deaths_cause.png" id="147" name="Picture"/>
+                    <pic:cNvPr descr="../output/aim1_fig2_deaths_cause.png" id="148" name="Picture"/>
                     <pic:cNvPicPr>
                       <a:picLocks noChangeArrowheads="1" noChangeAspect="1"/>
                     </pic:cNvPicPr>
                   </pic:nvPicPr>
                   <pic:blipFill>
-                    <a:blip r:embed="rId145"/>
+                    <a:blip r:embed="rId146"/>
                     <a:stretch>
                       <a:fillRect/>
                     </a:stretch>
@@ -6948,8 +7016,8 @@
       <w:pPr>
         <w:pStyle w:val="ImageCaption"/>
       </w:pPr>
-      <w:bookmarkStart w:id="148" w:name="fig:fig8-paper"/>
-      <w:bookmarkEnd w:id="148"/>
+      <w:bookmarkStart w:id="149" w:name="fig:fig8-paper"/>
+      <w:bookmarkEnd w:id="149"/>
       <w:r>
         <w:t xml:space="preserve">Figure 10.5: Note: Cumulative CVD deaths averted relative to business-as-usual across all modelled countries, stratified by cause of death and intervention scenario. Ischaemic heart disease accounts for the largest share of averted deaths across all interventions. Statin effects are restricted to ischaemic heart disease and ischaemic stroke; hypertension control affects all four causes.</w:t>
       </w:r>
@@ -6986,18 +7054,18 @@
           <wp:inline>
             <wp:extent cx="5334000" cy="2667000"/>
             <wp:effectExtent b="0" l="0" r="0" t="0"/>
-            <wp:docPr descr="Figure 10.6: Note: Cumulative disability-adjusted life years (DALYs) averted relative to business-as-usual across all modelled countries, by intervention scenario over 2026–2050. DALYs combine years of life lost (YLLs) and years lived with disability (YLDs) for ischaemic heart disease, ischaemic stroke, intracerebral haemorrhage, and hypertensive heart disease." title="" id="150" name="Picture"/>
+            <wp:docPr descr="Figure 10.6: Note: Cumulative disability-adjusted life years (DALYs) averted relative to business-as-usual across all modelled countries, by intervention scenario over 2026–2050. DALYs combine years of life lost (YLLs) and years lived with disability (YLDs) for ischaemic heart disease, ischaemic stroke, intracerebral haemorrhage, and hypertensive heart disease." title="" id="151" name="Picture"/>
             <a:graphic>
               <a:graphicData uri="http://schemas.openxmlformats.org/drawingml/2006/picture">
                 <pic:pic>
                   <pic:nvPicPr>
-                    <pic:cNvPr descr="../output/aim1_bod_fig1_dalys_ts.png" id="151" name="Picture"/>
+                    <pic:cNvPr descr="../output/aim1_bod_fig1_dalys_ts.png" id="152" name="Picture"/>
                     <pic:cNvPicPr>
                       <a:picLocks noChangeArrowheads="1" noChangeAspect="1"/>
                     </pic:cNvPicPr>
                   </pic:nvPicPr>
                   <pic:blipFill>
-                    <a:blip r:embed="rId149"/>
+                    <a:blip r:embed="rId150"/>
                     <a:stretch>
                       <a:fillRect/>
                     </a:stretch>
@@ -7028,8 +7096,8 @@
       <w:pPr>
         <w:pStyle w:val="ImageCaption"/>
       </w:pPr>
-      <w:bookmarkStart w:id="152" w:name="fig:fig9-paper"/>
-      <w:bookmarkEnd w:id="152"/>
+      <w:bookmarkStart w:id="153" w:name="fig:fig9-paper"/>
+      <w:bookmarkEnd w:id="153"/>
       <w:r>
         <w:t xml:space="preserve">Figure 10.6: Note: Cumulative disability-adjusted life years (DALYs) averted relative to business-as-usual across all modelled countries, by intervention scenario over 2026–2050. DALYs combine years of life lost (YLLs) and years lived with disability (YLDs) for ischaemic heart disease, ischaemic stroke, intracerebral haemorrhage, and hypertensive heart disease.</w:t>
       </w:r>
@@ -7066,18 +7134,18 @@
           <wp:inline>
             <wp:extent cx="5334000" cy="2424545"/>
             <wp:effectExtent b="0" l="0" r="0" t="0"/>
-            <wp:docPr descr="Figure 10.7: Note: Choropleth map showing cumulative CVD deaths averted per 100,000 population across all modelled countries under the combined intervention scenario (all three WHO targets achieved by 2030, sustained through 2050). Darker shading indicates larger per-capita health gains. Geographic variation reflects differences in baseline CVD burden, population age structure, and current treatment coverage." title="" id="154" name="Picture"/>
+            <wp:docPr descr="Figure 10.7: Note: Choropleth map showing cumulative CVD deaths averted per 100,000 population across all modelled countries under the combined intervention scenario (all three WHO targets achieved by 2030, sustained through 2050). Darker shading indicates larger per-capita health gains. Geographic variation reflects differences in baseline CVD burden, population age structure, and current treatment coverage." title="" id="155" name="Picture"/>
             <a:graphic>
               <a:graphicData uri="http://schemas.openxmlformats.org/drawingml/2006/picture">
                 <pic:pic>
                   <pic:nvPicPr>
-                    <pic:cNvPr descr="../output/aim1_fig6_map.png" id="155" name="Picture"/>
+                    <pic:cNvPr descr="../output/aim1_fig6_map.png" id="156" name="Picture"/>
                     <pic:cNvPicPr>
                       <a:picLocks noChangeArrowheads="1" noChangeAspect="1"/>
                     </pic:cNvPicPr>
                   </pic:nvPicPr>
                   <pic:blipFill>
-                    <a:blip r:embed="rId153"/>
+                    <a:blip r:embed="rId154"/>
                     <a:stretch>
                       <a:fillRect/>
                     </a:stretch>
@@ -7108,8 +7176,8 @@
       <w:pPr>
         <w:pStyle w:val="ImageCaption"/>
       </w:pPr>
-      <w:bookmarkStart w:id="156" w:name="fig:fig10-paper"/>
-      <w:bookmarkEnd w:id="156"/>
+      <w:bookmarkStart w:id="157" w:name="fig:fig10-paper"/>
+      <w:bookmarkEnd w:id="157"/>
       <w:r>
         <w:t xml:space="preserve">Figure 10.7: Note: Choropleth map showing cumulative CVD deaths averted per 100,000 population across all modelled countries under the combined intervention scenario (all three WHO targets achieved by 2030, sustained through 2050). Darker shading indicates larger per-capita health gains. Geographic variation reflects differences in baseline CVD burden, population age structure, and current treatment coverage.</w:t>
       </w:r>
@@ -7146,18 +7214,18 @@
           <wp:inline>
             <wp:extent cx="5334000" cy="3006436"/>
             <wp:effectExtent b="0" l="0" r="0" t="0"/>
-            <wp:docPr descr="Figure 10.8: Note: VSLY values as a proportion of discounted GNI, by WHO region and snapshot year (2026, 2030, 2040, 2050) and cumulative 2026–2050. Primary elasticity (differential 0.8 HIC / 1.2 LMIC per Robinson et al. 2019). Discounted at 3%. All Interventions scenario." title="" id="158" name="Picture"/>
+            <wp:docPr descr="Figure 10.8: Note: VSLY values as a proportion of discounted GNI, by WHO region and snapshot year (2026, 2030, 2040, 2050) and cumulative 2026–2050. Primary elasticity (differential 0.8 HIC / 1.2 LMIC per Robinson et al. 2019). Discounted at 3%. All Interventions scenario." title="" id="159" name="Picture"/>
             <a:graphic>
               <a:graphicData uri="http://schemas.openxmlformats.org/drawingml/2006/picture">
                 <pic:pic>
                   <pic:nvPicPr>
-                    <pic:cNvPr descr="../output/slides/sl_econ_dotplot.png" id="159" name="Picture"/>
+                    <pic:cNvPr descr="../output/slides/sl_econ_dotplot.png" id="160" name="Picture"/>
                     <pic:cNvPicPr>
                       <a:picLocks noChangeArrowheads="1" noChangeAspect="1"/>
                     </pic:cNvPicPr>
                   </pic:nvPicPr>
                   <pic:blipFill>
-                    <a:blip r:embed="rId157"/>
+                    <a:blip r:embed="rId158"/>
                     <a:stretch>
                       <a:fillRect/>
                     </a:stretch>
@@ -7188,8 +7256,8 @@
       <w:pPr>
         <w:pStyle w:val="ImageCaption"/>
       </w:pPr>
-      <w:bookmarkStart w:id="160" w:name="fig:fig-econ-dotplot"/>
-      <w:bookmarkEnd w:id="160"/>
+      <w:bookmarkStart w:id="161" w:name="fig:fig-econ-dotplot"/>
+      <w:bookmarkEnd w:id="161"/>
       <w:r>
         <w:t xml:space="preserve">Figure 10.8: Note: VSLY values as a proportion of discounted GNI, by WHO region and snapshot year (2026, 2030, 2040, 2050) and cumulative 2026–2050. Primary elasticity (differential 0.8 HIC / 1.2 LMIC per Robinson et al. 2019). Discounted at 3%. All Interventions scenario.</w:t>
       </w:r>
@@ -7199,8 +7267,8 @@
         <w:br w:type="page"/>
       </w:r>
     </w:p>
-    <w:bookmarkEnd w:id="161"/>
-    <w:bookmarkStart w:id="180" w:name="sec:math-details"/>
+    <w:bookmarkEnd w:id="162"/>
+    <w:bookmarkStart w:id="181" w:name="sec:math-details"/>
     <w:p>
       <w:pPr>
         <w:pStyle w:val="Heading2"/>
@@ -7218,7 +7286,7 @@
         <w:t xml:space="preserve">Methodology and Mathematical Details</w:t>
       </w:r>
     </w:p>
-    <w:bookmarkStart w:id="162" w:name="sec:math-notation"/>
+    <w:bookmarkStart w:id="163" w:name="sec:math-notation"/>
     <w:p>
       <w:pPr>
         <w:pStyle w:val="Heading3"/>
@@ -8753,8 +8821,8 @@
         <w:br w:type="page"/>
       </w:r>
     </w:p>
-    <w:bookmarkEnd w:id="162"/>
-    <w:bookmarkStart w:id="163" w:name="sec:param-appendix"/>
+    <w:bookmarkEnd w:id="163"/>
+    <w:bookmarkStart w:id="164" w:name="sec:param-appendix"/>
     <w:p>
       <w:pPr>
         <w:pStyle w:val="Heading3"/>
@@ -11709,8 +11777,8 @@
         <w:t xml:space="preserve">; UNWPP 2024: United Nations World Population Prospects 2024 revision.</w:t>
       </w:r>
     </w:p>
-    <w:bookmarkEnd w:id="163"/>
-    <w:bookmarkStart w:id="164" w:name="sec:transition-model"/>
+    <w:bookmarkEnd w:id="164"/>
+    <w:bookmarkStart w:id="165" w:name="sec:transition-model"/>
     <w:p>
       <w:pPr>
         <w:pStyle w:val="Heading3"/>
@@ -15733,8 +15801,8 @@
         <w:t xml:space="preserve">(Parameter values for all transition rates are listed in the Key Parameter Appendix.)</w:t>
       </w:r>
     </w:p>
-    <w:bookmarkEnd w:id="164"/>
-    <w:bookmarkStart w:id="166" w:name="sec:htn-model"/>
+    <w:bookmarkEnd w:id="165"/>
+    <w:bookmarkStart w:id="167" w:name="sec:htn-model"/>
     <w:p>
       <w:pPr>
         <w:pStyle w:val="Heading3"/>
@@ -19657,7 +19725,7 @@
         <w:t xml:space="preserve">(See Multi-State Transition Model for the baseline transition structure into which these effect ratios enter; see Key Parameter Appendix for all intervention effect sizes and their sources.)</w:t>
       </w:r>
     </w:p>
-    <w:bookmarkStart w:id="165" w:name="sec:htn-diabetes"/>
+    <w:bookmarkStart w:id="166" w:name="sec:htn-diabetes"/>
     <w:p>
       <w:pPr>
         <w:pStyle w:val="Heading4"/>
@@ -20467,9 +20535,9 @@
         <w:t xml:space="preserve">(See Hypertension Control Intervention Model above for the general-population coverage scale-up structure, which shares the same functional form.)</w:t>
       </w:r>
     </w:p>
-    <w:bookmarkEnd w:id="165"/>
     <w:bookmarkEnd w:id="166"/>
-    <w:bookmarkStart w:id="167" w:name="sec:statin-model"/>
+    <w:bookmarkEnd w:id="167"/>
+    <w:bookmarkStart w:id="168" w:name="sec:statin-model"/>
     <w:p>
       <w:pPr>
         <w:pStyle w:val="Heading3"/>
@@ -24107,8 +24175,8 @@
         <w:t xml:space="preserve">(See Key Parameter Appendix for all statin effect sizes and their sources.)</w:t>
       </w:r>
     </w:p>
-    <w:bookmarkEnd w:id="167"/>
-    <w:bookmarkStart w:id="172" w:name="sec:daly-methods"/>
+    <w:bookmarkEnd w:id="168"/>
+    <w:bookmarkStart w:id="173" w:name="sec:daly-methods"/>
     <w:p>
       <w:pPr>
         <w:pStyle w:val="Heading3"/>
@@ -24203,7 +24271,7 @@
         <w:t xml:space="preserve">.</w:t>
       </w:r>
     </w:p>
-    <w:bookmarkStart w:id="168" w:name="years-of-life-lost-yll"/>
+    <w:bookmarkStart w:id="169" w:name="years-of-life-lost-yll"/>
     <w:p>
       <w:pPr>
         <w:pStyle w:val="Heading4"/>
@@ -24632,8 +24700,8 @@
         <w:t xml:space="preserve">, taken from the United Nations World Population Prospects 2024 revision, medium variant (both sexes combined). Life expectancy values are country- and year-specific, reflecting projected demographic conditions rather than a fixed global standard.</w:t>
       </w:r>
     </w:p>
-    <w:bookmarkEnd w:id="168"/>
-    <w:bookmarkStart w:id="169" w:name="years-lived-with-disability-yld"/>
+    <w:bookmarkEnd w:id="169"/>
+    <w:bookmarkStart w:id="170" w:name="years-lived-with-disability-yld"/>
     <w:p>
       <w:pPr>
         <w:pStyle w:val="Heading4"/>
@@ -25156,8 +25224,8 @@
         <w:t xml:space="preserve">This approach yields an implicit, frequency-weighted average disability weight that reflects the severity distribution observed in each country. No explicit duration of disability was modelled; the prevalence-based formulation captures the YLD burden attributable to the stock of prevalent cases at each time point.</w:t>
       </w:r>
     </w:p>
-    <w:bookmarkEnd w:id="169"/>
-    <w:bookmarkStart w:id="170" w:name="disability-adjusted-life-years-daly"/>
+    <w:bookmarkEnd w:id="170"/>
+    <w:bookmarkStart w:id="171" w:name="disability-adjusted-life-years-daly"/>
     <w:p>
       <w:pPr>
         <w:pStyle w:val="Heading4"/>
@@ -25716,8 +25784,8 @@
         <w:t xml:space="preserve">The same differencing logic was applied separately to YLLs averted and YLDs averted.</w:t>
       </w:r>
     </w:p>
-    <w:bookmarkEnd w:id="170"/>
-    <w:bookmarkStart w:id="171" w:name="reference-standards-and-weights"/>
+    <w:bookmarkEnd w:id="171"/>
+    <w:bookmarkStart w:id="172" w:name="reference-standards-and-weights"/>
     <w:p>
       <w:pPr>
         <w:pStyle w:val="Heading4"/>
@@ -26114,9 +26182,9 @@
         <w:t xml:space="preserve">Sources: United Nations, Department of Economic and Social Affairs, Population Division (2024). World Population Prospects 2024, Online Edition. Institute for Health Metrics and Evaluation (IHME). Global Burden of Disease Study 2023 (GBD 2023) Results. Seattle, United States: IHME, 2024.</w:t>
       </w:r>
     </w:p>
-    <w:bookmarkEnd w:id="171"/>
     <w:bookmarkEnd w:id="172"/>
-    <w:bookmarkStart w:id="179" w:name="sec:econ-methods"/>
+    <w:bookmarkEnd w:id="173"/>
+    <w:bookmarkStart w:id="180" w:name="sec:econ-methods"/>
     <w:p>
       <w:pPr>
         <w:pStyle w:val="Heading3"/>
@@ -26151,7 +26219,7 @@
         <w:t xml:space="preserve">.</w:t>
       </w:r>
     </w:p>
-    <w:bookmarkStart w:id="173" w:name="value-of-a-statistical-life-vsl-transfer"/>
+    <w:bookmarkStart w:id="174" w:name="value-of-a-statistical-life-vsl-transfer"/>
     <w:p>
       <w:pPr>
         <w:pStyle w:val="Heading4"/>
@@ -26915,8 +26983,8 @@
         <w:t xml:space="preserve">is the minimum VSL-to-GNI ratio.</w:t>
       </w:r>
     </w:p>
-    <w:bookmarkEnd w:id="173"/>
-    <w:bookmarkStart w:id="174" w:name="gni-per-capita-projection"/>
+    <w:bookmarkEnd w:id="174"/>
+    <w:bookmarkStart w:id="175" w:name="gni-per-capita-projection"/>
     <w:p>
       <w:pPr>
         <w:pStyle w:val="Heading4"/>
@@ -27208,8 +27276,8 @@
         <w:t xml:space="preserve">, obtained by log-linear interpolation of five-year SSP nodes. This approach preserves observed GNI levels and applies only SSP-implied growth trajectories. A known limitation is that SSP projections provide GDP, not GNI, per capita; these series track closely for most countries but may diverge in economies with large net foreign income flows.</w:t>
       </w:r>
     </w:p>
-    <w:bookmarkEnd w:id="174"/>
-    <w:bookmarkStart w:id="175" w:name="value-of-a-statistical-life-year-vsly"/>
+    <w:bookmarkEnd w:id="175"/>
+    <w:bookmarkStart w:id="176" w:name="value-of-a-statistical-life-year-vsly"/>
     <w:p>
       <w:pPr>
         <w:pStyle w:val="Heading4"/>
@@ -27698,8 +27766,8 @@
         <w:t xml:space="preserve">.</w:t>
       </w:r>
     </w:p>
-    <w:bookmarkEnd w:id="175"/>
-    <w:bookmarkStart w:id="176" w:name="life-years-gained"/>
+    <w:bookmarkEnd w:id="176"/>
+    <w:bookmarkStart w:id="177" w:name="life-years-gained"/>
     <w:p>
       <w:pPr>
         <w:pStyle w:val="Heading4"/>
@@ -28471,8 +28539,8 @@
         <w:t xml:space="preserve">is the total number of deaths averted.</w:t>
       </w:r>
     </w:p>
-    <w:bookmarkEnd w:id="176"/>
-    <w:bookmarkStart w:id="177" w:name="discounting"/>
+    <w:bookmarkEnd w:id="177"/>
+    <w:bookmarkStart w:id="178" w:name="discounting"/>
     <w:p>
       <w:pPr>
         <w:pStyle w:val="Heading4"/>
@@ -29060,8 +29128,8 @@
         <w:t xml:space="preserve">is GNI per capita.</w:t>
       </w:r>
     </w:p>
-    <w:bookmarkEnd w:id="177"/>
-    <w:bookmarkStart w:id="178" w:name="parameter-summary"/>
+    <w:bookmarkEnd w:id="178"/>
+    <w:bookmarkStart w:id="179" w:name="parameter-summary"/>
     <w:p>
       <w:pPr>
         <w:pStyle w:val="Heading4"/>
@@ -29583,10 +29651,10 @@
         </w:tc>
       </w:tr>
     </w:tbl>
-    <w:bookmarkEnd w:id="178"/>
     <w:bookmarkEnd w:id="179"/>
     <w:bookmarkEnd w:id="180"/>
     <w:bookmarkEnd w:id="181"/>
+    <w:bookmarkEnd w:id="182"/>
     <w:sectPr>
       <w:footnotePr>
         <w:numRestart w:val="eachSect"/>

</xml_diff>